<commit_message>
adding documentation and readme files
</commit_message>
<xml_diff>
--- a/docs/aaa-platform-user-guide.docx
+++ b/docs/aaa-platform-user-guide.docx
@@ -128,7 +128,7 @@
         <w:pStyle w:val="Heading1"/>
       </w:pPr>
       <w:r>
-        <w:t xml:space="preserve">1. Getting Started</w:t>
+        <w:t xml:space="preserve">1. Kubernetes Deployment</w:t>
       </w:r>
     </w:p>
     <w:p>
@@ -136,7 +136,4190 @@
         <w:spacing w:after="120"/>
       </w:pPr>
       <w:r>
-        <w:t xml:space="preserve">This guide covers day-to-day operations for provisioning subscribers, managing IP address pools, and monitoring the AAA Cloud-Native Platform. It is intended for telecom network engineers and operations teams.</w:t>
+        <w:t xml:space="preserve">This section covers end-to-end deployment of the AAA Cloud-Native Platform on Kubernetes using the project Makefile. All operational commands are driven by make targets; no manual kubectl or helm invocations are required for the standard workflow.</w:t>
+      </w:r>
+    </w:p>
+    <w:p>
+      <w:pPr>
+        <w:spacing w:after="60"/>
+      </w:pPr>
+    </w:p>
+    <w:p>
+      <w:pPr>
+        <w:pStyle w:val="Heading2"/>
+      </w:pPr>
+      <w:r>
+        <w:t xml:space="preserve">1.1 Prerequisites</w:t>
+      </w:r>
+    </w:p>
+    <w:p>
+      <w:pPr>
+        <w:spacing w:after="120"/>
+      </w:pPr>
+      <w:r>
+        <w:t xml:space="preserve">Choose the environment that matches your setup:</w:t>
+      </w:r>
+    </w:p>
+    <w:tbl>
+      <w:tblPr>
+        <w:tblW w:type="dxa" w:w="9360"/>
+        <w:tblBorders>
+          <w:top w:val="single" w:color="auto" w:sz="4"/>
+          <w:left w:val="single" w:color="auto" w:sz="4"/>
+          <w:bottom w:val="single" w:color="auto" w:sz="4"/>
+          <w:right w:val="single" w:color="auto" w:sz="4"/>
+          <w:insideH w:val="single" w:color="auto" w:sz="4"/>
+          <w:insideV w:val="single" w:color="auto" w:sz="4"/>
+        </w:tblBorders>
+      </w:tblPr>
+      <w:tblGrid>
+        <w:gridCol w:w="2800"/>
+        <w:gridCol w:w="3000"/>
+        <w:gridCol w:w="3560"/>
+      </w:tblGrid>
+      <w:tr>
+        <w:trPr>
+          <w:tblHeader/>
+        </w:trPr>
+        <w:tc>
+          <w:tcPr>
+            <w:tcW w:type="dxa" w:w="2800"/>
+            <w:tcBorders>
+              <w:top w:val="single" w:color="CCCCCC" w:sz="1"/>
+              <w:left w:val="single" w:color="CCCCCC" w:sz="1"/>
+              <w:bottom w:val="single" w:color="CCCCCC" w:sz="1"/>
+              <w:right w:val="single" w:color="CCCCCC" w:sz="1"/>
+            </w:tcBorders>
+            <w:shd w:fill="2E75B6" w:val="clear"/>
+            <w:tcMar>
+              <w:top w:type="dxa" w:w="80"/>
+              <w:left w:type="dxa" w:w="120"/>
+              <w:bottom w:type="dxa" w:w="80"/>
+              <w:right w:type="dxa" w:w="120"/>
+            </w:tcMar>
+          </w:tcPr>
+          <w:p>
+            <w:pPr>
+              <w:spacing w:after="0"/>
+            </w:pPr>
+            <w:r>
+              <w:rPr>
+                <w:b/>
+                <w:bCs/>
+                <w:color w:val="FFFFFF"/>
+                <w:sz w:val="18"/>
+                <w:szCs w:val="18"/>
+              </w:rPr>
+              <w:t xml:space="preserve">Requirement</w:t>
+            </w:r>
+          </w:p>
+        </w:tc>
+        <w:tc>
+          <w:tcPr>
+            <w:tcW w:type="dxa" w:w="3000"/>
+            <w:tcBorders>
+              <w:top w:val="single" w:color="CCCCCC" w:sz="1"/>
+              <w:left w:val="single" w:color="CCCCCC" w:sz="1"/>
+              <w:bottom w:val="single" w:color="CCCCCC" w:sz="1"/>
+              <w:right w:val="single" w:color="CCCCCC" w:sz="1"/>
+            </w:tcBorders>
+            <w:shd w:fill="2E75B6" w:val="clear"/>
+            <w:tcMar>
+              <w:top w:type="dxa" w:w="80"/>
+              <w:left w:type="dxa" w:w="120"/>
+              <w:bottom w:type="dxa" w:w="80"/>
+              <w:right w:type="dxa" w:w="120"/>
+            </w:tcMar>
+          </w:tcPr>
+          <w:p>
+            <w:pPr>
+              <w:spacing w:after="0"/>
+            </w:pPr>
+            <w:r>
+              <w:rPr>
+                <w:b/>
+                <w:bCs/>
+                <w:color w:val="FFFFFF"/>
+                <w:sz w:val="18"/>
+                <w:szCs w:val="18"/>
+              </w:rPr>
+              <w:t xml:space="preserve">Docker Desktop path</w:t>
+            </w:r>
+          </w:p>
+        </w:tc>
+        <w:tc>
+          <w:tcPr>
+            <w:tcW w:type="dxa" w:w="3560"/>
+            <w:tcBorders>
+              <w:top w:val="single" w:color="CCCCCC" w:sz="1"/>
+              <w:left w:val="single" w:color="CCCCCC" w:sz="1"/>
+              <w:bottom w:val="single" w:color="CCCCCC" w:sz="1"/>
+              <w:right w:val="single" w:color="CCCCCC" w:sz="1"/>
+            </w:tcBorders>
+            <w:shd w:fill="2E75B6" w:val="clear"/>
+            <w:tcMar>
+              <w:top w:type="dxa" w:w="80"/>
+              <w:left w:type="dxa" w:w="120"/>
+              <w:bottom w:type="dxa" w:w="80"/>
+              <w:right w:type="dxa" w:w="120"/>
+            </w:tcMar>
+          </w:tcPr>
+          <w:p>
+            <w:pPr>
+              <w:spacing w:after="0"/>
+            </w:pPr>
+            <w:r>
+              <w:rPr>
+                <w:b/>
+                <w:bCs/>
+                <w:color w:val="FFFFFF"/>
+                <w:sz w:val="18"/>
+                <w:szCs w:val="18"/>
+              </w:rPr>
+              <w:t xml:space="preserve">k3d path</w:t>
+            </w:r>
+          </w:p>
+        </w:tc>
+      </w:tr>
+      <w:tr>
+        <w:tc>
+          <w:tcPr>
+            <w:tcW w:type="dxa" w:w="2800"/>
+            <w:tcBorders>
+              <w:top w:val="single" w:color="CCCCCC" w:sz="1"/>
+              <w:left w:val="single" w:color="CCCCCC" w:sz="1"/>
+              <w:bottom w:val="single" w:color="CCCCCC" w:sz="1"/>
+              <w:right w:val="single" w:color="CCCCCC" w:sz="1"/>
+            </w:tcBorders>
+            <w:shd w:fill="FFFFFF" w:val="clear"/>
+            <w:tcMar>
+              <w:top w:type="dxa" w:w="80"/>
+              <w:left w:type="dxa" w:w="120"/>
+              <w:bottom w:type="dxa" w:w="80"/>
+              <w:right w:type="dxa" w:w="120"/>
+            </w:tcMar>
+          </w:tcPr>
+          <w:p>
+            <w:pPr>
+              <w:spacing w:after="0"/>
+            </w:pPr>
+            <w:r>
+              <w:rPr>
+                <w:sz w:val="18"/>
+                <w:szCs w:val="18"/>
+              </w:rPr>
+              <w:t xml:space="preserve">Container runtime</w:t>
+            </w:r>
+          </w:p>
+        </w:tc>
+        <w:tc>
+          <w:tcPr>
+            <w:tcW w:type="dxa" w:w="3000"/>
+            <w:tcBorders>
+              <w:top w:val="single" w:color="CCCCCC" w:sz="1"/>
+              <w:left w:val="single" w:color="CCCCCC" w:sz="1"/>
+              <w:bottom w:val="single" w:color="CCCCCC" w:sz="1"/>
+              <w:right w:val="single" w:color="CCCCCC" w:sz="1"/>
+            </w:tcBorders>
+            <w:shd w:fill="FFFFFF" w:val="clear"/>
+            <w:tcMar>
+              <w:top w:type="dxa" w:w="80"/>
+              <w:left w:type="dxa" w:w="120"/>
+              <w:bottom w:type="dxa" w:w="80"/>
+              <w:right w:type="dxa" w:w="120"/>
+            </w:tcMar>
+          </w:tcPr>
+          <w:p>
+            <w:pPr>
+              <w:spacing w:after="0"/>
+            </w:pPr>
+            <w:r>
+              <w:rPr>
+                <w:sz w:val="18"/>
+                <w:szCs w:val="18"/>
+              </w:rPr>
+              <w:t xml:space="preserve">Docker Desktop (with Kubernetes enabled)</w:t>
+            </w:r>
+          </w:p>
+        </w:tc>
+        <w:tc>
+          <w:tcPr>
+            <w:tcW w:type="dxa" w:w="3560"/>
+            <w:tcBorders>
+              <w:top w:val="single" w:color="CCCCCC" w:sz="1"/>
+              <w:left w:val="single" w:color="CCCCCC" w:sz="1"/>
+              <w:bottom w:val="single" w:color="CCCCCC" w:sz="1"/>
+              <w:right w:val="single" w:color="CCCCCC" w:sz="1"/>
+            </w:tcBorders>
+            <w:shd w:fill="FFFFFF" w:val="clear"/>
+            <w:tcMar>
+              <w:top w:type="dxa" w:w="80"/>
+              <w:left w:type="dxa" w:w="120"/>
+              <w:bottom w:type="dxa" w:w="80"/>
+              <w:right w:type="dxa" w:w="120"/>
+            </w:tcMar>
+          </w:tcPr>
+          <w:p>
+            <w:pPr>
+              <w:spacing w:after="0"/>
+            </w:pPr>
+            <w:r>
+              <w:rPr>
+                <w:sz w:val="18"/>
+                <w:szCs w:val="18"/>
+              </w:rPr>
+              <w:t xml:space="preserve">Docker Desktop or Docker Engine</w:t>
+            </w:r>
+          </w:p>
+        </w:tc>
+      </w:tr>
+      <w:tr>
+        <w:tc>
+          <w:tcPr>
+            <w:tcW w:type="dxa" w:w="2800"/>
+            <w:tcBorders>
+              <w:top w:val="single" w:color="CCCCCC" w:sz="1"/>
+              <w:left w:val="single" w:color="CCCCCC" w:sz="1"/>
+              <w:bottom w:val="single" w:color="CCCCCC" w:sz="1"/>
+              <w:right w:val="single" w:color="CCCCCC" w:sz="1"/>
+            </w:tcBorders>
+            <w:shd w:fill="F2F2F2" w:val="clear"/>
+            <w:tcMar>
+              <w:top w:type="dxa" w:w="80"/>
+              <w:left w:type="dxa" w:w="120"/>
+              <w:bottom w:type="dxa" w:w="80"/>
+              <w:right w:type="dxa" w:w="120"/>
+            </w:tcMar>
+          </w:tcPr>
+          <w:p>
+            <w:pPr>
+              <w:spacing w:after="0"/>
+            </w:pPr>
+            <w:r>
+              <w:rPr>
+                <w:sz w:val="18"/>
+                <w:szCs w:val="18"/>
+              </w:rPr>
+              <w:t xml:space="preserve">Local cluster</w:t>
+            </w:r>
+          </w:p>
+        </w:tc>
+        <w:tc>
+          <w:tcPr>
+            <w:tcW w:type="dxa" w:w="3000"/>
+            <w:tcBorders>
+              <w:top w:val="single" w:color="CCCCCC" w:sz="1"/>
+              <w:left w:val="single" w:color="CCCCCC" w:sz="1"/>
+              <w:bottom w:val="single" w:color="CCCCCC" w:sz="1"/>
+              <w:right w:val="single" w:color="CCCCCC" w:sz="1"/>
+            </w:tcBorders>
+            <w:shd w:fill="F2F2F2" w:val="clear"/>
+            <w:tcMar>
+              <w:top w:type="dxa" w:w="80"/>
+              <w:left w:type="dxa" w:w="120"/>
+              <w:bottom w:type="dxa" w:w="80"/>
+              <w:right w:type="dxa" w:w="120"/>
+            </w:tcMar>
+          </w:tcPr>
+          <w:p>
+            <w:pPr>
+              <w:spacing w:after="0"/>
+            </w:pPr>
+            <w:r>
+              <w:rPr>
+                <w:sz w:val="18"/>
+                <w:szCs w:val="18"/>
+              </w:rPr>
+              <w:t xml:space="preserve">Docker Desktop built-in Kubernetes</w:t>
+            </w:r>
+          </w:p>
+        </w:tc>
+        <w:tc>
+          <w:tcPr>
+            <w:tcW w:type="dxa" w:w="3560"/>
+            <w:tcBorders>
+              <w:top w:val="single" w:color="CCCCCC" w:sz="1"/>
+              <w:left w:val="single" w:color="CCCCCC" w:sz="1"/>
+              <w:bottom w:val="single" w:color="CCCCCC" w:sz="1"/>
+              <w:right w:val="single" w:color="CCCCCC" w:sz="1"/>
+            </w:tcBorders>
+            <w:shd w:fill="F2F2F2" w:val="clear"/>
+            <w:tcMar>
+              <w:top w:type="dxa" w:w="80"/>
+              <w:left w:type="dxa" w:w="120"/>
+              <w:bottom w:type="dxa" w:w="80"/>
+              <w:right w:type="dxa" w:w="120"/>
+            </w:tcMar>
+          </w:tcPr>
+          <w:p>
+            <w:pPr>
+              <w:spacing w:after="0"/>
+            </w:pPr>
+            <w:r>
+              <w:rPr>
+                <w:sz w:val="18"/>
+                <w:szCs w:val="18"/>
+              </w:rPr>
+              <w:t xml:space="preserve">k3d v5+ (make cluster-up installs it)</w:t>
+            </w:r>
+          </w:p>
+        </w:tc>
+      </w:tr>
+      <w:tr>
+        <w:tc>
+          <w:tcPr>
+            <w:tcW w:type="dxa" w:w="2800"/>
+            <w:tcBorders>
+              <w:top w:val="single" w:color="CCCCCC" w:sz="1"/>
+              <w:left w:val="single" w:color="CCCCCC" w:sz="1"/>
+              <w:bottom w:val="single" w:color="CCCCCC" w:sz="1"/>
+              <w:right w:val="single" w:color="CCCCCC" w:sz="1"/>
+            </w:tcBorders>
+            <w:shd w:fill="FFFFFF" w:val="clear"/>
+            <w:tcMar>
+              <w:top w:type="dxa" w:w="80"/>
+              <w:left w:type="dxa" w:w="120"/>
+              <w:bottom w:type="dxa" w:w="80"/>
+              <w:right w:type="dxa" w:w="120"/>
+            </w:tcMar>
+          </w:tcPr>
+          <w:p>
+            <w:pPr>
+              <w:spacing w:after="0"/>
+            </w:pPr>
+            <w:r>
+              <w:rPr>
+                <w:sz w:val="18"/>
+                <w:szCs w:val="18"/>
+              </w:rPr>
+              <w:t xml:space="preserve">CLI tools</w:t>
+            </w:r>
+          </w:p>
+        </w:tc>
+        <w:tc>
+          <w:tcPr>
+            <w:tcW w:type="dxa" w:w="3000"/>
+            <w:tcBorders>
+              <w:top w:val="single" w:color="CCCCCC" w:sz="1"/>
+              <w:left w:val="single" w:color="CCCCCC" w:sz="1"/>
+              <w:bottom w:val="single" w:color="CCCCCC" w:sz="1"/>
+              <w:right w:val="single" w:color="CCCCCC" w:sz="1"/>
+            </w:tcBorders>
+            <w:shd w:fill="FFFFFF" w:val="clear"/>
+            <w:tcMar>
+              <w:top w:type="dxa" w:w="80"/>
+              <w:left w:type="dxa" w:w="120"/>
+              <w:bottom w:type="dxa" w:w="80"/>
+              <w:right w:type="dxa" w:w="120"/>
+            </w:tcMar>
+          </w:tcPr>
+          <w:p>
+            <w:pPr>
+              <w:spacing w:after="0"/>
+            </w:pPr>
+            <w:r>
+              <w:rPr>
+                <w:sz w:val="18"/>
+                <w:szCs w:val="18"/>
+              </w:rPr>
+              <w:t xml:space="preserve">kubectl, helm, make, git</w:t>
+            </w:r>
+          </w:p>
+        </w:tc>
+        <w:tc>
+          <w:tcPr>
+            <w:tcW w:type="dxa" w:w="3560"/>
+            <w:tcBorders>
+              <w:top w:val="single" w:color="CCCCCC" w:sz="1"/>
+              <w:left w:val="single" w:color="CCCCCC" w:sz="1"/>
+              <w:bottom w:val="single" w:color="CCCCCC" w:sz="1"/>
+              <w:right w:val="single" w:color="CCCCCC" w:sz="1"/>
+            </w:tcBorders>
+            <w:shd w:fill="FFFFFF" w:val="clear"/>
+            <w:tcMar>
+              <w:top w:type="dxa" w:w="80"/>
+              <w:left w:type="dxa" w:w="120"/>
+              <w:bottom w:type="dxa" w:w="80"/>
+              <w:right w:type="dxa" w:w="120"/>
+            </w:tcMar>
+          </w:tcPr>
+          <w:p>
+            <w:pPr>
+              <w:spacing w:after="0"/>
+            </w:pPr>
+            <w:r>
+              <w:rPr>
+                <w:sz w:val="18"/>
+                <w:szCs w:val="18"/>
+              </w:rPr>
+              <w:t xml:space="preserve">kubectl, helm, make, git, k3d</w:t>
+            </w:r>
+          </w:p>
+        </w:tc>
+      </w:tr>
+      <w:tr>
+        <w:tc>
+          <w:tcPr>
+            <w:tcW w:type="dxa" w:w="2800"/>
+            <w:tcBorders>
+              <w:top w:val="single" w:color="CCCCCC" w:sz="1"/>
+              <w:left w:val="single" w:color="CCCCCC" w:sz="1"/>
+              <w:bottom w:val="single" w:color="CCCCCC" w:sz="1"/>
+              <w:right w:val="single" w:color="CCCCCC" w:sz="1"/>
+            </w:tcBorders>
+            <w:shd w:fill="F2F2F2" w:val="clear"/>
+            <w:tcMar>
+              <w:top w:type="dxa" w:w="80"/>
+              <w:left w:type="dxa" w:w="120"/>
+              <w:bottom w:type="dxa" w:w="80"/>
+              <w:right w:type="dxa" w:w="120"/>
+            </w:tcMar>
+          </w:tcPr>
+          <w:p>
+            <w:pPr>
+              <w:spacing w:after="0"/>
+            </w:pPr>
+            <w:r>
+              <w:rPr>
+                <w:sz w:val="18"/>
+                <w:szCs w:val="18"/>
+              </w:rPr>
+              <w:t xml:space="preserve">Image registry</w:t>
+            </w:r>
+          </w:p>
+        </w:tc>
+        <w:tc>
+          <w:tcPr>
+            <w:tcW w:type="dxa" w:w="3000"/>
+            <w:tcBorders>
+              <w:top w:val="single" w:color="CCCCCC" w:sz="1"/>
+              <w:left w:val="single" w:color="CCCCCC" w:sz="1"/>
+              <w:bottom w:val="single" w:color="CCCCCC" w:sz="1"/>
+              <w:right w:val="single" w:color="CCCCCC" w:sz="1"/>
+            </w:tcBorders>
+            <w:shd w:fill="F2F2F2" w:val="clear"/>
+            <w:tcMar>
+              <w:top w:type="dxa" w:w="80"/>
+              <w:left w:type="dxa" w:w="120"/>
+              <w:bottom w:type="dxa" w:w="80"/>
+              <w:right w:type="dxa" w:w="120"/>
+            </w:tcMar>
+          </w:tcPr>
+          <w:p>
+            <w:pPr>
+              <w:spacing w:after="0"/>
+            </w:pPr>
+            <w:r>
+              <w:rPr>
+                <w:sz w:val="18"/>
+                <w:szCs w:val="18"/>
+              </w:rPr>
+              <w:t xml:space="preserve">Not required (pullPolicy: Never)</w:t>
+            </w:r>
+          </w:p>
+        </w:tc>
+        <w:tc>
+          <w:tcPr>
+            <w:tcW w:type="dxa" w:w="3560"/>
+            <w:tcBorders>
+              <w:top w:val="single" w:color="CCCCCC" w:sz="1"/>
+              <w:left w:val="single" w:color="CCCCCC" w:sz="1"/>
+              <w:bottom w:val="single" w:color="CCCCCC" w:sz="1"/>
+              <w:right w:val="single" w:color="CCCCCC" w:sz="1"/>
+            </w:tcBorders>
+            <w:shd w:fill="F2F2F2" w:val="clear"/>
+            <w:tcMar>
+              <w:top w:type="dxa" w:w="80"/>
+              <w:left w:type="dxa" w:w="120"/>
+              <w:bottom w:type="dxa" w:w="80"/>
+              <w:right w:type="dxa" w:w="120"/>
+            </w:tcMar>
+          </w:tcPr>
+          <w:p>
+            <w:pPr>
+              <w:spacing w:after="0"/>
+            </w:pPr>
+            <w:r>
+              <w:rPr>
+                <w:sz w:val="18"/>
+                <w:szCs w:val="18"/>
+              </w:rPr>
+              <w:t xml:space="preserve">k3d local registry (created by make cluster-up)</w:t>
+            </w:r>
+          </w:p>
+        </w:tc>
+      </w:tr>
+      <w:tr>
+        <w:tc>
+          <w:tcPr>
+            <w:tcW w:type="dxa" w:w="2800"/>
+            <w:tcBorders>
+              <w:top w:val="single" w:color="CCCCCC" w:sz="1"/>
+              <w:left w:val="single" w:color="CCCCCC" w:sz="1"/>
+              <w:bottom w:val="single" w:color="CCCCCC" w:sz="1"/>
+              <w:right w:val="single" w:color="CCCCCC" w:sz="1"/>
+            </w:tcBorders>
+            <w:shd w:fill="FFFFFF" w:val="clear"/>
+            <w:tcMar>
+              <w:top w:type="dxa" w:w="80"/>
+              <w:left w:type="dxa" w:w="120"/>
+              <w:bottom w:type="dxa" w:w="80"/>
+              <w:right w:type="dxa" w:w="120"/>
+            </w:tcMar>
+          </w:tcPr>
+          <w:p>
+            <w:pPr>
+              <w:spacing w:after="0"/>
+            </w:pPr>
+            <w:r>
+              <w:rPr>
+                <w:sz w:val="18"/>
+                <w:szCs w:val="18"/>
+              </w:rPr>
+              <w:t xml:space="preserve">Node.js (optional)</w:t>
+            </w:r>
+          </w:p>
+        </w:tc>
+        <w:tc>
+          <w:tcPr>
+            <w:tcW w:type="dxa" w:w="3000"/>
+            <w:tcBorders>
+              <w:top w:val="single" w:color="CCCCCC" w:sz="1"/>
+              <w:left w:val="single" w:color="CCCCCC" w:sz="1"/>
+              <w:bottom w:val="single" w:color="CCCCCC" w:sz="1"/>
+              <w:right w:val="single" w:color="CCCCCC" w:sz="1"/>
+            </w:tcBorders>
+            <w:shd w:fill="FFFFFF" w:val="clear"/>
+            <w:tcMar>
+              <w:top w:type="dxa" w:w="80"/>
+              <w:left w:type="dxa" w:w="120"/>
+              <w:bottom w:type="dxa" w:w="80"/>
+              <w:right w:type="dxa" w:w="120"/>
+            </w:tcMar>
+          </w:tcPr>
+          <w:p>
+            <w:pPr>
+              <w:spacing w:after="0"/>
+            </w:pPr>
+            <w:r>
+              <w:rPr>
+                <w:sz w:val="18"/>
+                <w:szCs w:val="18"/>
+              </w:rPr>
+              <w:t xml:space="preserve">For regenerating docs only</w:t>
+            </w:r>
+          </w:p>
+        </w:tc>
+        <w:tc>
+          <w:tcPr>
+            <w:tcW w:type="dxa" w:w="3560"/>
+            <w:tcBorders>
+              <w:top w:val="single" w:color="CCCCCC" w:sz="1"/>
+              <w:left w:val="single" w:color="CCCCCC" w:sz="1"/>
+              <w:bottom w:val="single" w:color="CCCCCC" w:sz="1"/>
+              <w:right w:val="single" w:color="CCCCCC" w:sz="1"/>
+            </w:tcBorders>
+            <w:shd w:fill="FFFFFF" w:val="clear"/>
+            <w:tcMar>
+              <w:top w:type="dxa" w:w="80"/>
+              <w:left w:type="dxa" w:w="120"/>
+              <w:bottom w:type="dxa" w:w="80"/>
+              <w:right w:type="dxa" w:w="120"/>
+            </w:tcMar>
+          </w:tcPr>
+          <w:p>
+            <w:pPr>
+              <w:spacing w:after="0"/>
+            </w:pPr>
+            <w:r>
+              <w:rPr>
+                <w:sz w:val="18"/>
+                <w:szCs w:val="18"/>
+              </w:rPr>
+              <w:t xml:space="preserve">For regenerating docs only</w:t>
+            </w:r>
+          </w:p>
+        </w:tc>
+      </w:tr>
+    </w:tbl>
+    <w:p>
+      <w:pPr>
+        <w:spacing w:after="60"/>
+      </w:pPr>
+    </w:p>
+    <w:tbl>
+      <w:tblPr>
+        <w:tblW w:type="dxa" w:w="9360"/>
+        <w:tblBorders>
+          <w:top w:val="single" w:color="auto" w:sz="4"/>
+          <w:left w:val="single" w:color="auto" w:sz="4"/>
+          <w:bottom w:val="single" w:color="auto" w:sz="4"/>
+          <w:right w:val="single" w:color="auto" w:sz="4"/>
+          <w:insideH w:val="single" w:color="auto" w:sz="4"/>
+          <w:insideV w:val="single" w:color="auto" w:sz="4"/>
+        </w:tblBorders>
+      </w:tblPr>
+      <w:tblGrid>
+        <w:gridCol w:w="9360"/>
+      </w:tblGrid>
+      <w:tr>
+        <w:tc>
+          <w:tcPr>
+            <w:tcW w:type="dxa" w:w="9360"/>
+            <w:tcBorders>
+              <w:top w:val="single" w:color="CCCCCC" w:sz="1"/>
+              <w:left w:val="single" w:color="2E75B6" w:sz="8"/>
+              <w:bottom w:val="single" w:color="CCCCCC" w:sz="1"/>
+              <w:right w:val="single" w:color="CCCCCC" w:sz="1"/>
+            </w:tcBorders>
+            <w:shd w:fill="D5E8F0" w:val="clear"/>
+            <w:tcMar>
+              <w:top w:type="dxa" w:w="80"/>
+              <w:left w:type="dxa" w:w="120"/>
+              <w:bottom w:type="dxa" w:w="80"/>
+              <w:right w:type="dxa" w:w="120"/>
+            </w:tcMar>
+          </w:tcPr>
+          <w:p>
+            <w:pPr>
+              <w:spacing w:after="40"/>
+            </w:pPr>
+            <w:r>
+              <w:rPr>
+                <w:b/>
+                <w:bCs/>
+                <w:color w:val="1F497D"/>
+              </w:rPr>
+              <w:t xml:space="preserve">First-time setup</w:t>
+            </w:r>
+          </w:p>
+          <w:p>
+            <w:pPr>
+              <w:spacing w:after="0"/>
+            </w:pPr>
+            <w:r>
+              <w:t xml:space="preserve">Before bootstrapping, copy the example env files and fill in required secrets:
+  cp subscriber-profile-api/.env.example subscriber-profile-api/.env
+  cp aaa-regression-tester/.env.example aaa-regression-tester/.env
+At minimum set RADIUS_SECRET — it has no default and the stack will refuse to start without it.</w:t>
+            </w:r>
+          </w:p>
+        </w:tc>
+      </w:tr>
+    </w:tbl>
+    <w:p>
+      <w:pPr>
+        <w:spacing w:after="80"/>
+      </w:pPr>
+    </w:p>
+    <w:p>
+      <w:pPr>
+        <w:pStyle w:val="Heading2"/>
+      </w:pPr>
+      <w:r>
+        <w:t xml:space="preserve">1.2 First-Time Bootstrap</w:t>
+      </w:r>
+    </w:p>
+    <w:p>
+      <w:pPr>
+        <w:spacing w:after="120"/>
+      </w:pPr>
+      <w:r>
+        <w:t xml:space="preserve">Run one of the following single commands to stand up the entire stack from scratch. Each command builds all images, configures the cluster, installs the Helm charts, and initialises the database.</w:t>
+      </w:r>
+    </w:p>
+    <w:p>
+      <w:pPr>
+        <w:spacing w:after="60"/>
+      </w:pPr>
+    </w:p>
+    <w:p>
+      <w:pPr>
+        <w:pStyle w:val="Heading3"/>
+      </w:pPr>
+      <w:r>
+        <w:t xml:space="preserve">Docker Desktop (recommended for laptops)</w:t>
+      </w:r>
+    </w:p>
+    <w:p>
+      <w:pPr>
+        <w:spacing w:after="120"/>
+      </w:pPr>
+      <w:r>
+        <w:t xml:space="preserve">Requires Docker Desktop with Kubernetes enabled in Settings &gt; Kubernetes.</w:t>
+      </w:r>
+    </w:p>
+    <w:p>
+      <w:pPr>
+        <w:pBdr>
+          <w:top w:val="single" w:color="CCCCCC" w:sz="2" w:space="1"/>
+          <w:bottom w:val="single" w:color="CCCCCC" w:sz="2" w:space="1"/>
+        </w:pBdr>
+        <w:shd w:fill="F0F0F0" w:val="clear"/>
+        <w:spacing w:after="60" w:before="60"/>
+        <w:ind w:left="360"/>
+      </w:pPr>
+      <w:r>
+        <w:rPr>
+          <w:rFonts w:ascii="Courier New" w:cs="Courier New" w:eastAsia="Courier New" w:hAnsi="Courier New"/>
+          <w:color w:val="1E1E1E"/>
+          <w:sz w:val="18"/>
+          <w:szCs w:val="18"/>
+        </w:rPr>
+        <w:t xml:space="preserve">make setup</w:t>
+      </w:r>
+    </w:p>
+    <w:p>
+      <w:pPr>
+        <w:spacing w:after="120"/>
+      </w:pPr>
+      <w:r>
+        <w:t xml:space="preserve">Runs in order: cnpg-install  →  nginx-install  →  hosts  →  build-cpp-bases  →  build-all  →  dep-update  →  prom-crds  →  deploy  →  db-init</w:t>
+      </w:r>
+    </w:p>
+    <w:p>
+      <w:pPr>
+        <w:spacing w:after="60"/>
+      </w:pPr>
+    </w:p>
+    <w:p>
+      <w:pPr>
+        <w:pStyle w:val="Heading3"/>
+      </w:pPr>
+      <w:r>
+        <w:t xml:space="preserve">k3d (lightweight multi-node clusters)</w:t>
+      </w:r>
+    </w:p>
+    <w:p>
+      <w:pPr>
+        <w:spacing w:after="120"/>
+      </w:pPr>
+      <w:r>
+        <w:t xml:space="preserve">Creates a local k3d cluster, builds and pushes images to the local registry, then deploys.</w:t>
+      </w:r>
+    </w:p>
+    <w:p>
+      <w:pPr>
+        <w:pBdr>
+          <w:top w:val="single" w:color="CCCCCC" w:sz="2" w:space="1"/>
+          <w:bottom w:val="single" w:color="CCCCCC" w:sz="2" w:space="1"/>
+        </w:pBdr>
+        <w:shd w:fill="F0F0F0" w:val="clear"/>
+        <w:spacing w:after="60" w:before="60"/>
+        <w:ind w:left="360"/>
+      </w:pPr>
+      <w:r>
+        <w:rPr>
+          <w:rFonts w:ascii="Courier New" w:cs="Courier New" w:eastAsia="Courier New" w:hAnsi="Courier New"/>
+          <w:color w:val="1E1E1E"/>
+          <w:sz w:val="18"/>
+          <w:szCs w:val="18"/>
+        </w:rPr>
+        <w:t xml:space="preserve">make bootstrap</w:t>
+      </w:r>
+    </w:p>
+    <w:p>
+      <w:pPr>
+        <w:spacing w:after="120"/>
+      </w:pPr>
+      <w:r>
+        <w:t xml:space="preserve">Runs in order: cluster-up  →  hosts  →  build-cpp-bases  →  build-all  →  push-all  →  dep-update  →  prom-crds  →  deploy  →  db-init</w:t>
+      </w:r>
+    </w:p>
+    <w:p>
+      <w:pPr>
+        <w:spacing w:after="60"/>
+      </w:pPr>
+    </w:p>
+    <w:tbl>
+      <w:tblPr>
+        <w:tblW w:type="dxa" w:w="9360"/>
+        <w:tblBorders>
+          <w:top w:val="single" w:color="auto" w:sz="4"/>
+          <w:left w:val="single" w:color="auto" w:sz="4"/>
+          <w:bottom w:val="single" w:color="auto" w:sz="4"/>
+          <w:right w:val="single" w:color="auto" w:sz="4"/>
+          <w:insideH w:val="single" w:color="auto" w:sz="4"/>
+          <w:insideV w:val="single" w:color="auto" w:sz="4"/>
+        </w:tblBorders>
+      </w:tblPr>
+      <w:tblGrid>
+        <w:gridCol w:w="9360"/>
+      </w:tblGrid>
+      <w:tr>
+        <w:tc>
+          <w:tcPr>
+            <w:tcW w:type="dxa" w:w="9360"/>
+            <w:tcBorders>
+              <w:top w:val="single" w:color="CCCCCC" w:sz="1"/>
+              <w:left w:val="single" w:color="2E75B6" w:sz="8"/>
+              <w:bottom w:val="single" w:color="CCCCCC" w:sz="1"/>
+              <w:right w:val="single" w:color="CCCCCC" w:sz="1"/>
+            </w:tcBorders>
+            <w:shd w:fill="D5E8F0" w:val="clear"/>
+            <w:tcMar>
+              <w:top w:type="dxa" w:w="80"/>
+              <w:left w:type="dxa" w:w="120"/>
+              <w:bottom w:type="dxa" w:w="80"/>
+              <w:right w:type="dxa" w:w="120"/>
+            </w:tcMar>
+          </w:tcPr>
+          <w:p>
+            <w:pPr>
+              <w:spacing w:after="40"/>
+            </w:pPr>
+            <w:r>
+              <w:rPr>
+                <w:b/>
+                <w:bCs/>
+                <w:color w:val="1F497D"/>
+              </w:rPr>
+              <w:t xml:space="preserve">build-cpp-bases is slow the first time</w:t>
+            </w:r>
+          </w:p>
+          <w:p>
+            <w:pPr>
+              <w:spacing w:after="0"/>
+            </w:pPr>
+            <w:r>
+              <w:t xml:space="preserve">The make build-cpp-bases step compiles vcpkg dependencies and may take 10–20 minutes on first run. Subsequent builds skip it unless vcpkg.json changes. Run make build-cpp-bases separately if you update C++ dependencies.</w:t>
+            </w:r>
+          </w:p>
+        </w:tc>
+      </w:tr>
+    </w:tbl>
+    <w:p>
+      <w:pPr>
+        <w:spacing w:after="80"/>
+      </w:pPr>
+    </w:p>
+    <w:p>
+      <w:pPr>
+        <w:pStyle w:val="Heading2"/>
+      </w:pPr>
+      <w:r>
+        <w:t xml:space="preserve">1.3 Image Build Targets</w:t>
+      </w:r>
+    </w:p>
+    <w:p>
+      <w:pPr>
+        <w:spacing w:after="120"/>
+      </w:pPr>
+      <w:r>
+        <w:t xml:space="preserve">After the initial bootstrap, use these targets for incremental image builds during development:</w:t>
+      </w:r>
+    </w:p>
+    <w:tbl>
+      <w:tblPr>
+        <w:tblW w:type="dxa" w:w="9360"/>
+        <w:tblBorders>
+          <w:top w:val="single" w:color="auto" w:sz="4"/>
+          <w:left w:val="single" w:color="auto" w:sz="4"/>
+          <w:bottom w:val="single" w:color="auto" w:sz="4"/>
+          <w:right w:val="single" w:color="auto" w:sz="4"/>
+          <w:insideH w:val="single" w:color="auto" w:sz="4"/>
+          <w:insideV w:val="single" w:color="auto" w:sz="4"/>
+        </w:tblBorders>
+      </w:tblPr>
+      <w:tblGrid>
+        <w:gridCol w:w="3200"/>
+        <w:gridCol w:w="6160"/>
+      </w:tblGrid>
+      <w:tr>
+        <w:trPr>
+          <w:tblHeader/>
+        </w:trPr>
+        <w:tc>
+          <w:tcPr>
+            <w:tcW w:type="dxa" w:w="3200"/>
+            <w:tcBorders>
+              <w:top w:val="single" w:color="CCCCCC" w:sz="1"/>
+              <w:left w:val="single" w:color="CCCCCC" w:sz="1"/>
+              <w:bottom w:val="single" w:color="CCCCCC" w:sz="1"/>
+              <w:right w:val="single" w:color="CCCCCC" w:sz="1"/>
+            </w:tcBorders>
+            <w:shd w:fill="2E75B6" w:val="clear"/>
+            <w:tcMar>
+              <w:top w:type="dxa" w:w="80"/>
+              <w:left w:type="dxa" w:w="120"/>
+              <w:bottom w:type="dxa" w:w="80"/>
+              <w:right w:type="dxa" w:w="120"/>
+            </w:tcMar>
+          </w:tcPr>
+          <w:p>
+            <w:pPr>
+              <w:spacing w:after="0"/>
+            </w:pPr>
+            <w:r>
+              <w:rPr>
+                <w:b/>
+                <w:bCs/>
+                <w:color w:val="FFFFFF"/>
+                <w:sz w:val="18"/>
+                <w:szCs w:val="18"/>
+              </w:rPr>
+              <w:t xml:space="preserve">Command</w:t>
+            </w:r>
+          </w:p>
+        </w:tc>
+        <w:tc>
+          <w:tcPr>
+            <w:tcW w:type="dxa" w:w="6160"/>
+            <w:tcBorders>
+              <w:top w:val="single" w:color="CCCCCC" w:sz="1"/>
+              <w:left w:val="single" w:color="CCCCCC" w:sz="1"/>
+              <w:bottom w:val="single" w:color="CCCCCC" w:sz="1"/>
+              <w:right w:val="single" w:color="CCCCCC" w:sz="1"/>
+            </w:tcBorders>
+            <w:shd w:fill="2E75B6" w:val="clear"/>
+            <w:tcMar>
+              <w:top w:type="dxa" w:w="80"/>
+              <w:left w:type="dxa" w:w="120"/>
+              <w:bottom w:type="dxa" w:w="80"/>
+              <w:right w:type="dxa" w:w="120"/>
+            </w:tcMar>
+          </w:tcPr>
+          <w:p>
+            <w:pPr>
+              <w:spacing w:after="0"/>
+            </w:pPr>
+            <w:r>
+              <w:rPr>
+                <w:b/>
+                <w:bCs/>
+                <w:color w:val="FFFFFF"/>
+                <w:sz w:val="18"/>
+                <w:szCs w:val="18"/>
+              </w:rPr>
+              <w:t xml:space="preserve">Description</w:t>
+            </w:r>
+          </w:p>
+        </w:tc>
+      </w:tr>
+      <w:tr>
+        <w:tc>
+          <w:tcPr>
+            <w:tcW w:type="dxa" w:w="3200"/>
+            <w:tcBorders>
+              <w:top w:val="single" w:color="CCCCCC" w:sz="1"/>
+              <w:left w:val="single" w:color="CCCCCC" w:sz="1"/>
+              <w:bottom w:val="single" w:color="CCCCCC" w:sz="1"/>
+              <w:right w:val="single" w:color="CCCCCC" w:sz="1"/>
+            </w:tcBorders>
+            <w:shd w:fill="FFFFFF" w:val="clear"/>
+            <w:tcMar>
+              <w:top w:type="dxa" w:w="80"/>
+              <w:left w:type="dxa" w:w="120"/>
+              <w:bottom w:type="dxa" w:w="80"/>
+              <w:right w:type="dxa" w:w="120"/>
+            </w:tcMar>
+          </w:tcPr>
+          <w:p>
+            <w:pPr>
+              <w:spacing w:after="0"/>
+            </w:pPr>
+            <w:r>
+              <w:rPr>
+                <w:sz w:val="18"/>
+                <w:szCs w:val="18"/>
+              </w:rPr>
+              <w:t xml:space="preserve">make build-cpp-bases</w:t>
+            </w:r>
+          </w:p>
+        </w:tc>
+        <w:tc>
+          <w:tcPr>
+            <w:tcW w:type="dxa" w:w="6160"/>
+            <w:tcBorders>
+              <w:top w:val="single" w:color="CCCCCC" w:sz="1"/>
+              <w:left w:val="single" w:color="CCCCCC" w:sz="1"/>
+              <w:bottom w:val="single" w:color="CCCCCC" w:sz="1"/>
+              <w:right w:val="single" w:color="CCCCCC" w:sz="1"/>
+            </w:tcBorders>
+            <w:shd w:fill="FFFFFF" w:val="clear"/>
+            <w:tcMar>
+              <w:top w:type="dxa" w:w="80"/>
+              <w:left w:type="dxa" w:w="120"/>
+              <w:bottom w:type="dxa" w:w="80"/>
+              <w:right w:type="dxa" w:w="120"/>
+            </w:tcMar>
+          </w:tcPr>
+          <w:p>
+            <w:pPr>
+              <w:spacing w:after="0"/>
+            </w:pPr>
+            <w:r>
+              <w:rPr>
+                <w:sz w:val="18"/>
+                <w:szCs w:val="18"/>
+              </w:rPr>
+              <w:t xml:space="preserve">Build vcpkg/CMake base images. Run once, or after changing vcpkg.json</w:t>
+            </w:r>
+          </w:p>
+        </w:tc>
+      </w:tr>
+      <w:tr>
+        <w:tc>
+          <w:tcPr>
+            <w:tcW w:type="dxa" w:w="3200"/>
+            <w:tcBorders>
+              <w:top w:val="single" w:color="CCCCCC" w:sz="1"/>
+              <w:left w:val="single" w:color="CCCCCC" w:sz="1"/>
+              <w:bottom w:val="single" w:color="CCCCCC" w:sz="1"/>
+              <w:right w:val="single" w:color="CCCCCC" w:sz="1"/>
+            </w:tcBorders>
+            <w:shd w:fill="F2F2F2" w:val="clear"/>
+            <w:tcMar>
+              <w:top w:type="dxa" w:w="80"/>
+              <w:left w:type="dxa" w:w="120"/>
+              <w:bottom w:type="dxa" w:w="80"/>
+              <w:right w:type="dxa" w:w="120"/>
+            </w:tcMar>
+          </w:tcPr>
+          <w:p>
+            <w:pPr>
+              <w:spacing w:after="0"/>
+            </w:pPr>
+            <w:r>
+              <w:rPr>
+                <w:sz w:val="18"/>
+                <w:szCs w:val="18"/>
+              </w:rPr>
+              <w:t xml:space="preserve">make build-all</w:t>
+            </w:r>
+          </w:p>
+        </w:tc>
+        <w:tc>
+          <w:tcPr>
+            <w:tcW w:type="dxa" w:w="6160"/>
+            <w:tcBorders>
+              <w:top w:val="single" w:color="CCCCCC" w:sz="1"/>
+              <w:left w:val="single" w:color="CCCCCC" w:sz="1"/>
+              <w:bottom w:val="single" w:color="CCCCCC" w:sz="1"/>
+              <w:right w:val="single" w:color="CCCCCC" w:sz="1"/>
+            </w:tcBorders>
+            <w:shd w:fill="F2F2F2" w:val="clear"/>
+            <w:tcMar>
+              <w:top w:type="dxa" w:w="80"/>
+              <w:left w:type="dxa" w:w="120"/>
+              <w:bottom w:type="dxa" w:w="80"/>
+              <w:right w:type="dxa" w:w="120"/>
+            </w:tcMar>
+          </w:tcPr>
+          <w:p>
+            <w:pPr>
+              <w:spacing w:after="0"/>
+            </w:pPr>
+            <w:r>
+              <w:rPr>
+                <w:sz w:val="18"/>
+                <w:szCs w:val="18"/>
+              </w:rPr>
+              <w:t xml:space="preserve">Build all 5 service images (requires build-cpp-bases to have run first)</w:t>
+            </w:r>
+          </w:p>
+        </w:tc>
+      </w:tr>
+      <w:tr>
+        <w:tc>
+          <w:tcPr>
+            <w:tcW w:type="dxa" w:w="3200"/>
+            <w:tcBorders>
+              <w:top w:val="single" w:color="CCCCCC" w:sz="1"/>
+              <w:left w:val="single" w:color="CCCCCC" w:sz="1"/>
+              <w:bottom w:val="single" w:color="CCCCCC" w:sz="1"/>
+              <w:right w:val="single" w:color="CCCCCC" w:sz="1"/>
+            </w:tcBorders>
+            <w:shd w:fill="FFFFFF" w:val="clear"/>
+            <w:tcMar>
+              <w:top w:type="dxa" w:w="80"/>
+              <w:left w:type="dxa" w:w="120"/>
+              <w:bottom w:type="dxa" w:w="80"/>
+              <w:right w:type="dxa" w:w="120"/>
+            </w:tcMar>
+          </w:tcPr>
+          <w:p>
+            <w:pPr>
+              <w:spacing w:after="0"/>
+            </w:pPr>
+            <w:r>
+              <w:rPr>
+                <w:sz w:val="18"/>
+                <w:szCs w:val="18"/>
+              </w:rPr>
+              <w:t xml:space="preserve">make push-all</w:t>
+            </w:r>
+          </w:p>
+        </w:tc>
+        <w:tc>
+          <w:tcPr>
+            <w:tcW w:type="dxa" w:w="6160"/>
+            <w:tcBorders>
+              <w:top w:val="single" w:color="CCCCCC" w:sz="1"/>
+              <w:left w:val="single" w:color="CCCCCC" w:sz="1"/>
+              <w:bottom w:val="single" w:color="CCCCCC" w:sz="1"/>
+              <w:right w:val="single" w:color="CCCCCC" w:sz="1"/>
+            </w:tcBorders>
+            <w:shd w:fill="FFFFFF" w:val="clear"/>
+            <w:tcMar>
+              <w:top w:type="dxa" w:w="80"/>
+              <w:left w:type="dxa" w:w="120"/>
+              <w:bottom w:type="dxa" w:w="80"/>
+              <w:right w:type="dxa" w:w="120"/>
+            </w:tcMar>
+          </w:tcPr>
+          <w:p>
+            <w:pPr>
+              <w:spacing w:after="0"/>
+            </w:pPr>
+            <w:r>
+              <w:rPr>
+                <w:sz w:val="18"/>
+                <w:szCs w:val="18"/>
+              </w:rPr>
+              <w:t xml:space="preserve">Push all images to the registry (required for k3d; not needed for Docker Desktop)</w:t>
+            </w:r>
+          </w:p>
+        </w:tc>
+      </w:tr>
+      <w:tr>
+        <w:tc>
+          <w:tcPr>
+            <w:tcW w:type="dxa" w:w="3200"/>
+            <w:tcBorders>
+              <w:top w:val="single" w:color="CCCCCC" w:sz="1"/>
+              <w:left w:val="single" w:color="CCCCCC" w:sz="1"/>
+              <w:bottom w:val="single" w:color="CCCCCC" w:sz="1"/>
+              <w:right w:val="single" w:color="CCCCCC" w:sz="1"/>
+            </w:tcBorders>
+            <w:shd w:fill="F2F2F2" w:val="clear"/>
+            <w:tcMar>
+              <w:top w:type="dxa" w:w="80"/>
+              <w:left w:type="dxa" w:w="120"/>
+              <w:bottom w:type="dxa" w:w="80"/>
+              <w:right w:type="dxa" w:w="120"/>
+            </w:tcMar>
+          </w:tcPr>
+          <w:p>
+            <w:pPr>
+              <w:spacing w:after="0"/>
+            </w:pPr>
+            <w:r>
+              <w:rPr>
+                <w:sz w:val="18"/>
+                <w:szCs w:val="18"/>
+              </w:rPr>
+              <w:t xml:space="preserve">make build-api</w:t>
+            </w:r>
+          </w:p>
+        </w:tc>
+        <w:tc>
+          <w:tcPr>
+            <w:tcW w:type="dxa" w:w="6160"/>
+            <w:tcBorders>
+              <w:top w:val="single" w:color="CCCCCC" w:sz="1"/>
+              <w:left w:val="single" w:color="CCCCCC" w:sz="1"/>
+              <w:bottom w:val="single" w:color="CCCCCC" w:sz="1"/>
+              <w:right w:val="single" w:color="CCCCCC" w:sz="1"/>
+            </w:tcBorders>
+            <w:shd w:fill="F2F2F2" w:val="clear"/>
+            <w:tcMar>
+              <w:top w:type="dxa" w:w="80"/>
+              <w:left w:type="dxa" w:w="120"/>
+              <w:bottom w:type="dxa" w:w="80"/>
+              <w:right w:type="dxa" w:w="120"/>
+            </w:tcMar>
+          </w:tcPr>
+          <w:p>
+            <w:pPr>
+              <w:spacing w:after="0"/>
+            </w:pPr>
+            <w:r>
+              <w:rPr>
+                <w:sz w:val="18"/>
+                <w:szCs w:val="18"/>
+              </w:rPr>
+              <w:t xml:space="preserve">Rebuild subscriber-profile-api image and trigger a rolling restart in the cluster</w:t>
+            </w:r>
+          </w:p>
+        </w:tc>
+      </w:tr>
+      <w:tr>
+        <w:tc>
+          <w:tcPr>
+            <w:tcW w:type="dxa" w:w="3200"/>
+            <w:tcBorders>
+              <w:top w:val="single" w:color="CCCCCC" w:sz="1"/>
+              <w:left w:val="single" w:color="CCCCCC" w:sz="1"/>
+              <w:bottom w:val="single" w:color="CCCCCC" w:sz="1"/>
+              <w:right w:val="single" w:color="CCCCCC" w:sz="1"/>
+            </w:tcBorders>
+            <w:shd w:fill="FFFFFF" w:val="clear"/>
+            <w:tcMar>
+              <w:top w:type="dxa" w:w="80"/>
+              <w:left w:type="dxa" w:w="120"/>
+              <w:bottom w:type="dxa" w:w="80"/>
+              <w:right w:type="dxa" w:w="120"/>
+            </w:tcMar>
+          </w:tcPr>
+          <w:p>
+            <w:pPr>
+              <w:spacing w:after="0"/>
+            </w:pPr>
+            <w:r>
+              <w:rPr>
+                <w:sz w:val="18"/>
+                <w:szCs w:val="18"/>
+              </w:rPr>
+              <w:t xml:space="preserve">make build-lookup</w:t>
+            </w:r>
+          </w:p>
+        </w:tc>
+        <w:tc>
+          <w:tcPr>
+            <w:tcW w:type="dxa" w:w="6160"/>
+            <w:tcBorders>
+              <w:top w:val="single" w:color="CCCCCC" w:sz="1"/>
+              <w:left w:val="single" w:color="CCCCCC" w:sz="1"/>
+              <w:bottom w:val="single" w:color="CCCCCC" w:sz="1"/>
+              <w:right w:val="single" w:color="CCCCCC" w:sz="1"/>
+            </w:tcBorders>
+            <w:shd w:fill="FFFFFF" w:val="clear"/>
+            <w:tcMar>
+              <w:top w:type="dxa" w:w="80"/>
+              <w:left w:type="dxa" w:w="120"/>
+              <w:bottom w:type="dxa" w:w="80"/>
+              <w:right w:type="dxa" w:w="120"/>
+            </w:tcMar>
+          </w:tcPr>
+          <w:p>
+            <w:pPr>
+              <w:spacing w:after="0"/>
+            </w:pPr>
+            <w:r>
+              <w:rPr>
+                <w:sz w:val="18"/>
+                <w:szCs w:val="18"/>
+              </w:rPr>
+              <w:t xml:space="preserve">Rebuild aaa-lookup-service image and trigger a rolling restart in the cluster</w:t>
+            </w:r>
+          </w:p>
+        </w:tc>
+      </w:tr>
+    </w:tbl>
+    <w:p>
+      <w:pPr>
+        <w:spacing w:after="60"/>
+      </w:pPr>
+    </w:p>
+    <w:tbl>
+      <w:tblPr>
+        <w:tblW w:type="dxa" w:w="9360"/>
+        <w:tblBorders>
+          <w:top w:val="single" w:color="auto" w:sz="4"/>
+          <w:left w:val="single" w:color="auto" w:sz="4"/>
+          <w:bottom w:val="single" w:color="auto" w:sz="4"/>
+          <w:right w:val="single" w:color="auto" w:sz="4"/>
+          <w:insideH w:val="single" w:color="auto" w:sz="4"/>
+          <w:insideV w:val="single" w:color="auto" w:sz="4"/>
+        </w:tblBorders>
+      </w:tblPr>
+      <w:tblGrid>
+        <w:gridCol w:w="9360"/>
+      </w:tblGrid>
+      <w:tr>
+        <w:tc>
+          <w:tcPr>
+            <w:tcW w:type="dxa" w:w="9360"/>
+            <w:tcBorders>
+              <w:top w:val="single" w:color="CCCCCC" w:sz="1"/>
+              <w:left w:val="single" w:color="2E75B6" w:sz="8"/>
+              <w:bottom w:val="single" w:color="CCCCCC" w:sz="1"/>
+              <w:right w:val="single" w:color="CCCCCC" w:sz="1"/>
+            </w:tcBorders>
+            <w:shd w:fill="D5E8F0" w:val="clear"/>
+            <w:tcMar>
+              <w:top w:type="dxa" w:w="80"/>
+              <w:left w:type="dxa" w:w="120"/>
+              <w:bottom w:type="dxa" w:w="80"/>
+              <w:right w:type="dxa" w:w="120"/>
+            </w:tcMar>
+          </w:tcPr>
+          <w:p>
+            <w:pPr>
+              <w:spacing w:after="40"/>
+            </w:pPr>
+            <w:r>
+              <w:rPr>
+                <w:b/>
+                <w:bCs/>
+                <w:color w:val="1F497D"/>
+              </w:rPr>
+              <w:t xml:space="preserve">Tip</w:t>
+            </w:r>
+          </w:p>
+          <w:p>
+            <w:pPr>
+              <w:spacing w:after="0"/>
+            </w:pPr>
+            <w:r>
+              <w:t xml:space="preserve">For rapid Python code iteration, make build-api rebuilds only the API image and immediately restarts the pod — no full make build-all needed. For C++ changes, make build-lookup does the same for aaa-lookup-service.</w:t>
+            </w:r>
+          </w:p>
+        </w:tc>
+      </w:tr>
+    </w:tbl>
+    <w:p>
+      <w:pPr>
+        <w:spacing w:after="80"/>
+      </w:pPr>
+    </w:p>
+    <w:p>
+      <w:pPr>
+        <w:pStyle w:val="Heading2"/>
+      </w:pPr>
+      <w:r>
+        <w:t xml:space="preserve">1.4 Deploy and Upgrade</w:t>
+      </w:r>
+    </w:p>
+    <w:p>
+      <w:pPr>
+        <w:spacing w:after="120"/>
+      </w:pPr>
+      <w:r>
+        <w:t xml:space="preserve">After images are built, deploy or upgrade the platform with:</w:t>
+      </w:r>
+    </w:p>
+    <w:p>
+      <w:pPr>
+        <w:pBdr>
+          <w:top w:val="single" w:color="CCCCCC" w:sz="2" w:space="1"/>
+          <w:bottom w:val="single" w:color="CCCCCC" w:sz="2" w:space="1"/>
+        </w:pBdr>
+        <w:shd w:fill="F0F0F0" w:val="clear"/>
+        <w:spacing w:after="60" w:before="60"/>
+        <w:ind w:left="360"/>
+      </w:pPr>
+      <w:r>
+        <w:rPr>
+          <w:rFonts w:ascii="Courier New" w:cs="Courier New" w:eastAsia="Courier New" w:hAnsi="Courier New"/>
+          <w:color w:val="1E1E1E"/>
+          <w:sz w:val="18"/>
+          <w:szCs w:val="18"/>
+        </w:rPr>
+        <w:t xml:space="preserve"># Development mode (default)</w:t>
+      </w:r>
+    </w:p>
+    <w:p>
+      <w:pPr>
+        <w:pBdr>
+          <w:top w:val="single" w:color="CCCCCC" w:sz="2" w:space="1"/>
+          <w:bottom w:val="single" w:color="CCCCCC" w:sz="2" w:space="1"/>
+        </w:pBdr>
+        <w:shd w:fill="F0F0F0" w:val="clear"/>
+        <w:spacing w:after="60" w:before="60"/>
+        <w:ind w:left="360"/>
+      </w:pPr>
+      <w:r>
+        <w:rPr>
+          <w:rFonts w:ascii="Courier New" w:cs="Courier New" w:eastAsia="Courier New" w:hAnsi="Courier New"/>
+          <w:color w:val="1E1E1E"/>
+          <w:sz w:val="18"/>
+          <w:szCs w:val="18"/>
+        </w:rPr>
+        <w:t xml:space="preserve">make deploy</w:t>
+      </w:r>
+    </w:p>
+    <w:p>
+      <w:pPr>
+        <w:pBdr>
+          <w:top w:val="single" w:color="CCCCCC" w:sz="2" w:space="1"/>
+          <w:bottom w:val="single" w:color="CCCCCC" w:sz="2" w:space="1"/>
+        </w:pBdr>
+        <w:shd w:fill="F0F0F0" w:val="clear"/>
+        <w:spacing w:after="60" w:before="60"/>
+        <w:ind w:left="360"/>
+      </w:pPr>
+      <w:r>
+        <w:rPr>
+          <w:rFonts w:ascii="Courier New" w:cs="Courier New" w:eastAsia="Courier New" w:hAnsi="Courier New"/>
+          <w:color w:val="1E1E1E"/>
+          <w:sz w:val="18"/>
+          <w:szCs w:val="18"/>
+        </w:rPr>
+        <w:t xml:space="preserve"/>
+      </w:r>
+    </w:p>
+    <w:p>
+      <w:pPr>
+        <w:pBdr>
+          <w:top w:val="single" w:color="CCCCCC" w:sz="2" w:space="1"/>
+          <w:bottom w:val="single" w:color="CCCCCC" w:sz="2" w:space="1"/>
+        </w:pBdr>
+        <w:shd w:fill="F0F0F0" w:val="clear"/>
+        <w:spacing w:after="60" w:before="60"/>
+        <w:ind w:left="360"/>
+      </w:pPr>
+      <w:r>
+        <w:rPr>
+          <w:rFonts w:ascii="Courier New" w:cs="Courier New" w:eastAsia="Courier New" w:hAnsi="Courier New"/>
+          <w:color w:val="1E1E1E"/>
+          <w:sz w:val="18"/>
+          <w:szCs w:val="18"/>
+        </w:rPr>
+        <w:t xml:space="preserve"># High-availability mode (anti-affinity, PDBs, 3 PgBouncer replicas)</w:t>
+      </w:r>
+    </w:p>
+    <w:p>
+      <w:pPr>
+        <w:pBdr>
+          <w:top w:val="single" w:color="CCCCCC" w:sz="2" w:space="1"/>
+          <w:bottom w:val="single" w:color="CCCCCC" w:sz="2" w:space="1"/>
+        </w:pBdr>
+        <w:shd w:fill="F0F0F0" w:val="clear"/>
+        <w:spacing w:after="60" w:before="60"/>
+        <w:ind w:left="360"/>
+      </w:pPr>
+      <w:r>
+        <w:rPr>
+          <w:rFonts w:ascii="Courier New" w:cs="Courier New" w:eastAsia="Courier New" w:hAnsi="Courier New"/>
+          <w:color w:val="1E1E1E"/>
+          <w:sz w:val="18"/>
+          <w:szCs w:val="18"/>
+        </w:rPr>
+        <w:t xml:space="preserve">make deploy-ha</w:t>
+      </w:r>
+    </w:p>
+    <w:p>
+      <w:pPr>
+        <w:spacing w:after="60"/>
+      </w:pPr>
+    </w:p>
+    <w:p>
+      <w:pPr>
+        <w:spacing w:after="120"/>
+      </w:pPr>
+      <w:r>
+        <w:t xml:space="preserve">Both targets run helm upgrade --install with a 10-minute timeout and automatically run db-init afterwards to apply any pending schema changes. Re-running deploy is safe and idempotent.</w:t>
+      </w:r>
+    </w:p>
+    <w:p>
+      <w:pPr>
+        <w:spacing w:after="60"/>
+      </w:pPr>
+    </w:p>
+    <w:tbl>
+      <w:tblPr>
+        <w:tblW w:type="dxa" w:w="9360"/>
+        <w:tblBorders>
+          <w:top w:val="single" w:color="auto" w:sz="4"/>
+          <w:left w:val="single" w:color="auto" w:sz="4"/>
+          <w:bottom w:val="single" w:color="auto" w:sz="4"/>
+          <w:right w:val="single" w:color="auto" w:sz="4"/>
+          <w:insideH w:val="single" w:color="auto" w:sz="4"/>
+          <w:insideV w:val="single" w:color="auto" w:sz="4"/>
+        </w:tblBorders>
+      </w:tblPr>
+      <w:tblGrid>
+        <w:gridCol w:w="2200"/>
+        <w:gridCol w:w="3000"/>
+        <w:gridCol w:w="4160"/>
+      </w:tblGrid>
+      <w:tr>
+        <w:trPr>
+          <w:tblHeader/>
+        </w:trPr>
+        <w:tc>
+          <w:tcPr>
+            <w:tcW w:type="dxa" w:w="2200"/>
+            <w:tcBorders>
+              <w:top w:val="single" w:color="CCCCCC" w:sz="1"/>
+              <w:left w:val="single" w:color="CCCCCC" w:sz="1"/>
+              <w:bottom w:val="single" w:color="CCCCCC" w:sz="1"/>
+              <w:right w:val="single" w:color="CCCCCC" w:sz="1"/>
+            </w:tcBorders>
+            <w:shd w:fill="2E75B6" w:val="clear"/>
+            <w:tcMar>
+              <w:top w:type="dxa" w:w="80"/>
+              <w:left w:type="dxa" w:w="120"/>
+              <w:bottom w:type="dxa" w:w="80"/>
+              <w:right w:type="dxa" w:w="120"/>
+            </w:tcMar>
+          </w:tcPr>
+          <w:p>
+            <w:pPr>
+              <w:spacing w:after="0"/>
+            </w:pPr>
+            <w:r>
+              <w:rPr>
+                <w:b/>
+                <w:bCs/>
+                <w:color w:val="FFFFFF"/>
+                <w:sz w:val="18"/>
+                <w:szCs w:val="18"/>
+              </w:rPr>
+              <w:t xml:space="preserve">Values file</w:t>
+            </w:r>
+          </w:p>
+        </w:tc>
+        <w:tc>
+          <w:tcPr>
+            <w:tcW w:type="dxa" w:w="3000"/>
+            <w:tcBorders>
+              <w:top w:val="single" w:color="CCCCCC" w:sz="1"/>
+              <w:left w:val="single" w:color="CCCCCC" w:sz="1"/>
+              <w:bottom w:val="single" w:color="CCCCCC" w:sz="1"/>
+              <w:right w:val="single" w:color="CCCCCC" w:sz="1"/>
+            </w:tcBorders>
+            <w:shd w:fill="2E75B6" w:val="clear"/>
+            <w:tcMar>
+              <w:top w:type="dxa" w:w="80"/>
+              <w:left w:type="dxa" w:w="120"/>
+              <w:bottom w:type="dxa" w:w="80"/>
+              <w:right w:type="dxa" w:w="120"/>
+            </w:tcMar>
+          </w:tcPr>
+          <w:p>
+            <w:pPr>
+              <w:spacing w:after="0"/>
+            </w:pPr>
+            <w:r>
+              <w:rPr>
+                <w:b/>
+                <w:bCs/>
+                <w:color w:val="FFFFFF"/>
+                <w:sz w:val="18"/>
+                <w:szCs w:val="18"/>
+              </w:rPr>
+              <w:t xml:space="preserve">Use case</w:t>
+            </w:r>
+          </w:p>
+        </w:tc>
+        <w:tc>
+          <w:tcPr>
+            <w:tcW w:type="dxa" w:w="4160"/>
+            <w:tcBorders>
+              <w:top w:val="single" w:color="CCCCCC" w:sz="1"/>
+              <w:left w:val="single" w:color="CCCCCC" w:sz="1"/>
+              <w:bottom w:val="single" w:color="CCCCCC" w:sz="1"/>
+              <w:right w:val="single" w:color="CCCCCC" w:sz="1"/>
+            </w:tcBorders>
+            <w:shd w:fill="2E75B6" w:val="clear"/>
+            <w:tcMar>
+              <w:top w:type="dxa" w:w="80"/>
+              <w:left w:type="dxa" w:w="120"/>
+              <w:bottom w:type="dxa" w:w="80"/>
+              <w:right w:type="dxa" w:w="120"/>
+            </w:tcMar>
+          </w:tcPr>
+          <w:p>
+            <w:pPr>
+              <w:spacing w:after="0"/>
+            </w:pPr>
+            <w:r>
+              <w:rPr>
+                <w:b/>
+                <w:bCs/>
+                <w:color w:val="FFFFFF"/>
+                <w:sz w:val="18"/>
+                <w:szCs w:val="18"/>
+              </w:rPr>
+              <w:t xml:space="preserve">Key differences</w:t>
+            </w:r>
+          </w:p>
+        </w:tc>
+      </w:tr>
+      <w:tr>
+        <w:tc>
+          <w:tcPr>
+            <w:tcW w:type="dxa" w:w="2200"/>
+            <w:tcBorders>
+              <w:top w:val="single" w:color="CCCCCC" w:sz="1"/>
+              <w:left w:val="single" w:color="CCCCCC" w:sz="1"/>
+              <w:bottom w:val="single" w:color="CCCCCC" w:sz="1"/>
+              <w:right w:val="single" w:color="CCCCCC" w:sz="1"/>
+            </w:tcBorders>
+            <w:shd w:fill="FFFFFF" w:val="clear"/>
+            <w:tcMar>
+              <w:top w:type="dxa" w:w="80"/>
+              <w:left w:type="dxa" w:w="120"/>
+              <w:bottom w:type="dxa" w:w="80"/>
+              <w:right w:type="dxa" w:w="120"/>
+            </w:tcMar>
+          </w:tcPr>
+          <w:p>
+            <w:pPr>
+              <w:spacing w:after="0"/>
+            </w:pPr>
+            <w:r>
+              <w:rPr>
+                <w:sz w:val="18"/>
+                <w:szCs w:val="18"/>
+              </w:rPr>
+              <w:t xml:space="preserve">values-dev.yaml</w:t>
+            </w:r>
+          </w:p>
+        </w:tc>
+        <w:tc>
+          <w:tcPr>
+            <w:tcW w:type="dxa" w:w="3000"/>
+            <w:tcBorders>
+              <w:top w:val="single" w:color="CCCCCC" w:sz="1"/>
+              <w:left w:val="single" w:color="CCCCCC" w:sz="1"/>
+              <w:bottom w:val="single" w:color="CCCCCC" w:sz="1"/>
+              <w:right w:val="single" w:color="CCCCCC" w:sz="1"/>
+            </w:tcBorders>
+            <w:shd w:fill="FFFFFF" w:val="clear"/>
+            <w:tcMar>
+              <w:top w:type="dxa" w:w="80"/>
+              <w:left w:type="dxa" w:w="120"/>
+              <w:bottom w:type="dxa" w:w="80"/>
+              <w:right w:type="dxa" w:w="120"/>
+            </w:tcMar>
+          </w:tcPr>
+          <w:p>
+            <w:pPr>
+              <w:spacing w:after="0"/>
+            </w:pPr>
+            <w:r>
+              <w:rPr>
+                <w:sz w:val="18"/>
+                <w:szCs w:val="18"/>
+              </w:rPr>
+              <w:t xml:space="preserve">Local development and CI</w:t>
+            </w:r>
+          </w:p>
+        </w:tc>
+        <w:tc>
+          <w:tcPr>
+            <w:tcW w:type="dxa" w:w="4160"/>
+            <w:tcBorders>
+              <w:top w:val="single" w:color="CCCCCC" w:sz="1"/>
+              <w:left w:val="single" w:color="CCCCCC" w:sz="1"/>
+              <w:bottom w:val="single" w:color="CCCCCC" w:sz="1"/>
+              <w:right w:val="single" w:color="CCCCCC" w:sz="1"/>
+            </w:tcBorders>
+            <w:shd w:fill="FFFFFF" w:val="clear"/>
+            <w:tcMar>
+              <w:top w:type="dxa" w:w="80"/>
+              <w:left w:type="dxa" w:w="120"/>
+              <w:bottom w:type="dxa" w:w="80"/>
+              <w:right w:type="dxa" w:w="120"/>
+            </w:tcMar>
+          </w:tcPr>
+          <w:p>
+            <w:pPr>
+              <w:spacing w:after="0"/>
+            </w:pPr>
+            <w:r>
+              <w:rPr>
+                <w:sz w:val="18"/>
+                <w:szCs w:val="18"/>
+              </w:rPr>
+              <w:t xml:space="preserve">Single replicas, pullPolicy: Never, dev-grafana password, JWT_SKIP_VERIFY</w:t>
+            </w:r>
+          </w:p>
+        </w:tc>
+      </w:tr>
+      <w:tr>
+        <w:tc>
+          <w:tcPr>
+            <w:tcW w:type="dxa" w:w="2200"/>
+            <w:tcBorders>
+              <w:top w:val="single" w:color="CCCCCC" w:sz="1"/>
+              <w:left w:val="single" w:color="CCCCCC" w:sz="1"/>
+              <w:bottom w:val="single" w:color="CCCCCC" w:sz="1"/>
+              <w:right w:val="single" w:color="CCCCCC" w:sz="1"/>
+            </w:tcBorders>
+            <w:shd w:fill="F2F2F2" w:val="clear"/>
+            <w:tcMar>
+              <w:top w:type="dxa" w:w="80"/>
+              <w:left w:type="dxa" w:w="120"/>
+              <w:bottom w:type="dxa" w:w="80"/>
+              <w:right w:type="dxa" w:w="120"/>
+            </w:tcMar>
+          </w:tcPr>
+          <w:p>
+            <w:pPr>
+              <w:spacing w:after="0"/>
+            </w:pPr>
+            <w:r>
+              <w:rPr>
+                <w:sz w:val="18"/>
+                <w:szCs w:val="18"/>
+              </w:rPr>
+              <w:t xml:space="preserve">values-ha.yaml</w:t>
+            </w:r>
+          </w:p>
+        </w:tc>
+        <w:tc>
+          <w:tcPr>
+            <w:tcW w:type="dxa" w:w="3000"/>
+            <w:tcBorders>
+              <w:top w:val="single" w:color="CCCCCC" w:sz="1"/>
+              <w:left w:val="single" w:color="CCCCCC" w:sz="1"/>
+              <w:bottom w:val="single" w:color="CCCCCC" w:sz="1"/>
+              <w:right w:val="single" w:color="CCCCCC" w:sz="1"/>
+            </w:tcBorders>
+            <w:shd w:fill="F2F2F2" w:val="clear"/>
+            <w:tcMar>
+              <w:top w:type="dxa" w:w="80"/>
+              <w:left w:type="dxa" w:w="120"/>
+              <w:bottom w:type="dxa" w:w="80"/>
+              <w:right w:type="dxa" w:w="120"/>
+            </w:tcMar>
+          </w:tcPr>
+          <w:p>
+            <w:pPr>
+              <w:spacing w:after="0"/>
+            </w:pPr>
+            <w:r>
+              <w:rPr>
+                <w:sz w:val="18"/>
+                <w:szCs w:val="18"/>
+              </w:rPr>
+              <w:t xml:space="preserve">Staging and production simulation</w:t>
+            </w:r>
+          </w:p>
+        </w:tc>
+        <w:tc>
+          <w:tcPr>
+            <w:tcW w:type="dxa" w:w="4160"/>
+            <w:tcBorders>
+              <w:top w:val="single" w:color="CCCCCC" w:sz="1"/>
+              <w:left w:val="single" w:color="CCCCCC" w:sz="1"/>
+              <w:bottom w:val="single" w:color="CCCCCC" w:sz="1"/>
+              <w:right w:val="single" w:color="CCCCCC" w:sz="1"/>
+            </w:tcBorders>
+            <w:shd w:fill="F2F2F2" w:val="clear"/>
+            <w:tcMar>
+              <w:top w:type="dxa" w:w="80"/>
+              <w:left w:type="dxa" w:w="120"/>
+              <w:bottom w:type="dxa" w:w="80"/>
+              <w:right w:type="dxa" w:w="120"/>
+            </w:tcMar>
+          </w:tcPr>
+          <w:p>
+            <w:pPr>
+              <w:spacing w:after="0"/>
+            </w:pPr>
+            <w:r>
+              <w:rPr>
+                <w:sz w:val="18"/>
+                <w:szCs w:val="18"/>
+              </w:rPr>
+              <w:t xml:space="preserve">Anti-affinity rules, PodDisruptionBudgets, 3 PgBouncer replicas, stricter resource limits</w:t>
+            </w:r>
+          </w:p>
+        </w:tc>
+      </w:tr>
+    </w:tbl>
+    <w:p>
+      <w:pPr>
+        <w:spacing w:after="80"/>
+      </w:pPr>
+    </w:p>
+    <w:p>
+      <w:pPr>
+        <w:pStyle w:val="Heading2"/>
+      </w:pPr>
+      <w:r>
+        <w:t xml:space="preserve">1.5 Database Initialisation</w:t>
+      </w:r>
+    </w:p>
+    <w:p>
+      <w:pPr>
+        <w:spacing w:after="120"/>
+      </w:pPr>
+      <w:r>
+        <w:t xml:space="preserve">Schema creation and grants are handled by a dedicated script that is idempotent — safe to run multiple times:</w:t>
+      </w:r>
+    </w:p>
+    <w:p>
+      <w:pPr>
+        <w:pBdr>
+          <w:top w:val="single" w:color="CCCCCC" w:sz="2" w:space="1"/>
+          <w:bottom w:val="single" w:color="CCCCCC" w:sz="2" w:space="1"/>
+        </w:pBdr>
+        <w:shd w:fill="F0F0F0" w:val="clear"/>
+        <w:spacing w:after="60" w:before="60"/>
+        <w:ind w:left="360"/>
+      </w:pPr>
+      <w:r>
+        <w:rPr>
+          <w:rFonts w:ascii="Courier New" w:cs="Courier New" w:eastAsia="Courier New" w:hAnsi="Courier New"/>
+          <w:color w:val="1E1E1E"/>
+          <w:sz w:val="18"/>
+          <w:szCs w:val="18"/>
+        </w:rPr>
+        <w:t xml:space="preserve">make db-init</w:t>
+      </w:r>
+    </w:p>
+    <w:p>
+      <w:pPr>
+        <w:spacing w:after="60"/>
+      </w:pPr>
+    </w:p>
+    <w:p>
+      <w:pPr>
+        <w:spacing w:after="120"/>
+      </w:pPr>
+      <w:r>
+        <w:t xml:space="preserve">This runs bash scripts/db-init.sh which creates all tables (if they do not exist), creates the aaa_app role, and grants the necessary privileges. It is called automatically by make deploy and make bootstrap, but can be run independently after a cluster restart or schema change.</w:t>
+      </w:r>
+    </w:p>
+    <w:p>
+      <w:pPr>
+        <w:spacing w:after="80"/>
+      </w:pPr>
+    </w:p>
+    <w:p>
+      <w:pPr>
+        <w:pStyle w:val="Heading2"/>
+      </w:pPr>
+      <w:r>
+        <w:t xml:space="preserve">1.6 Verify the Deployment</w:t>
+      </w:r>
+    </w:p>
+    <w:p>
+      <w:pPr>
+        <w:pBdr>
+          <w:top w:val="single" w:color="CCCCCC" w:sz="2" w:space="1"/>
+          <w:bottom w:val="single" w:color="CCCCCC" w:sz="2" w:space="1"/>
+        </w:pBdr>
+        <w:shd w:fill="F0F0F0" w:val="clear"/>
+        <w:spacing w:after="60" w:before="60"/>
+        <w:ind w:left="360"/>
+      </w:pPr>
+      <w:r>
+        <w:rPr>
+          <w:rFonts w:ascii="Courier New" w:cs="Courier New" w:eastAsia="Courier New" w:hAnsi="Courier New"/>
+          <w:color w:val="1E1E1E"/>
+          <w:sz w:val="18"/>
+          <w:szCs w:val="18"/>
+        </w:rPr>
+        <w:t xml:space="preserve">make status</w:t>
+      </w:r>
+    </w:p>
+    <w:p>
+      <w:pPr>
+        <w:spacing w:after="120"/>
+      </w:pPr>
+      <w:r>
+        <w:t xml:space="preserve">Displays pods, services, ingress objects, PVCs, the CNPG cluster state, and any active Jobs in the aaa-platform namespace. All pods should show Running or Completed.</w:t>
+      </w:r>
+    </w:p>
+    <w:p>
+      <w:pPr>
+        <w:spacing w:after="60"/>
+      </w:pPr>
+    </w:p>
+    <w:p>
+      <w:pPr>
+        <w:spacing w:after="120"/>
+      </w:pPr>
+      <w:r>
+        <w:t xml:space="preserve">After a successful deploy, services are reachable via Ingress at these local URLs (added to /etc/hosts by make hosts):</w:t>
+      </w:r>
+    </w:p>
+    <w:tbl>
+      <w:tblPr>
+        <w:tblW w:type="dxa" w:w="9360"/>
+        <w:tblBorders>
+          <w:top w:val="single" w:color="auto" w:sz="4"/>
+          <w:left w:val="single" w:color="auto" w:sz="4"/>
+          <w:bottom w:val="single" w:color="auto" w:sz="4"/>
+          <w:right w:val="single" w:color="auto" w:sz="4"/>
+          <w:insideH w:val="single" w:color="auto" w:sz="4"/>
+          <w:insideV w:val="single" w:color="auto" w:sz="4"/>
+        </w:tblBorders>
+      </w:tblPr>
+      <w:tblGrid>
+        <w:gridCol w:w="3200"/>
+        <w:gridCol w:w="2400"/>
+        <w:gridCol w:w="3760"/>
+      </w:tblGrid>
+      <w:tr>
+        <w:trPr>
+          <w:tblHeader/>
+        </w:trPr>
+        <w:tc>
+          <w:tcPr>
+            <w:tcW w:type="dxa" w:w="3200"/>
+            <w:tcBorders>
+              <w:top w:val="single" w:color="CCCCCC" w:sz="1"/>
+              <w:left w:val="single" w:color="CCCCCC" w:sz="1"/>
+              <w:bottom w:val="single" w:color="CCCCCC" w:sz="1"/>
+              <w:right w:val="single" w:color="CCCCCC" w:sz="1"/>
+            </w:tcBorders>
+            <w:shd w:fill="2E75B6" w:val="clear"/>
+            <w:tcMar>
+              <w:top w:type="dxa" w:w="80"/>
+              <w:left w:type="dxa" w:w="120"/>
+              <w:bottom w:type="dxa" w:w="80"/>
+              <w:right w:type="dxa" w:w="120"/>
+            </w:tcMar>
+          </w:tcPr>
+          <w:p>
+            <w:pPr>
+              <w:spacing w:after="0"/>
+            </w:pPr>
+            <w:r>
+              <w:rPr>
+                <w:b/>
+                <w:bCs/>
+                <w:color w:val="FFFFFF"/>
+                <w:sz w:val="18"/>
+                <w:szCs w:val="18"/>
+              </w:rPr>
+              <w:t xml:space="preserve">URL</w:t>
+            </w:r>
+          </w:p>
+        </w:tc>
+        <w:tc>
+          <w:tcPr>
+            <w:tcW w:type="dxa" w:w="2400"/>
+            <w:tcBorders>
+              <w:top w:val="single" w:color="CCCCCC" w:sz="1"/>
+              <w:left w:val="single" w:color="CCCCCC" w:sz="1"/>
+              <w:bottom w:val="single" w:color="CCCCCC" w:sz="1"/>
+              <w:right w:val="single" w:color="CCCCCC" w:sz="1"/>
+            </w:tcBorders>
+            <w:shd w:fill="2E75B6" w:val="clear"/>
+            <w:tcMar>
+              <w:top w:type="dxa" w:w="80"/>
+              <w:left w:type="dxa" w:w="120"/>
+              <w:bottom w:type="dxa" w:w="80"/>
+              <w:right w:type="dxa" w:w="120"/>
+            </w:tcMar>
+          </w:tcPr>
+          <w:p>
+            <w:pPr>
+              <w:spacing w:after="0"/>
+            </w:pPr>
+            <w:r>
+              <w:rPr>
+                <w:b/>
+                <w:bCs/>
+                <w:color w:val="FFFFFF"/>
+                <w:sz w:val="18"/>
+                <w:szCs w:val="18"/>
+              </w:rPr>
+              <w:t xml:space="preserve">Service</w:t>
+            </w:r>
+          </w:p>
+        </w:tc>
+        <w:tc>
+          <w:tcPr>
+            <w:tcW w:type="dxa" w:w="3760"/>
+            <w:tcBorders>
+              <w:top w:val="single" w:color="CCCCCC" w:sz="1"/>
+              <w:left w:val="single" w:color="CCCCCC" w:sz="1"/>
+              <w:bottom w:val="single" w:color="CCCCCC" w:sz="1"/>
+              <w:right w:val="single" w:color="CCCCCC" w:sz="1"/>
+            </w:tcBorders>
+            <w:shd w:fill="2E75B6" w:val="clear"/>
+            <w:tcMar>
+              <w:top w:type="dxa" w:w="80"/>
+              <w:left w:type="dxa" w:w="120"/>
+              <w:bottom w:type="dxa" w:w="80"/>
+              <w:right w:type="dxa" w:w="120"/>
+            </w:tcMar>
+          </w:tcPr>
+          <w:p>
+            <w:pPr>
+              <w:spacing w:after="0"/>
+            </w:pPr>
+            <w:r>
+              <w:rPr>
+                <w:b/>
+                <w:bCs/>
+                <w:color w:val="FFFFFF"/>
+                <w:sz w:val="18"/>
+                <w:szCs w:val="18"/>
+              </w:rPr>
+              <w:t xml:space="preserve">Notes</w:t>
+            </w:r>
+          </w:p>
+        </w:tc>
+      </w:tr>
+      <w:tr>
+        <w:tc>
+          <w:tcPr>
+            <w:tcW w:type="dxa" w:w="3200"/>
+            <w:tcBorders>
+              <w:top w:val="single" w:color="CCCCCC" w:sz="1"/>
+              <w:left w:val="single" w:color="CCCCCC" w:sz="1"/>
+              <w:bottom w:val="single" w:color="CCCCCC" w:sz="1"/>
+              <w:right w:val="single" w:color="CCCCCC" w:sz="1"/>
+            </w:tcBorders>
+            <w:shd w:fill="FFFFFF" w:val="clear"/>
+            <w:tcMar>
+              <w:top w:type="dxa" w:w="80"/>
+              <w:left w:type="dxa" w:w="120"/>
+              <w:bottom w:type="dxa" w:w="80"/>
+              <w:right w:type="dxa" w:w="120"/>
+            </w:tcMar>
+          </w:tcPr>
+          <w:p>
+            <w:pPr>
+              <w:spacing w:after="0"/>
+            </w:pPr>
+            <w:r>
+              <w:rPr>
+                <w:sz w:val="18"/>
+                <w:szCs w:val="18"/>
+              </w:rPr>
+              <w:t xml:space="preserve">http://ui.aaa.localhost</w:t>
+            </w:r>
+          </w:p>
+        </w:tc>
+        <w:tc>
+          <w:tcPr>
+            <w:tcW w:type="dxa" w:w="2400"/>
+            <w:tcBorders>
+              <w:top w:val="single" w:color="CCCCCC" w:sz="1"/>
+              <w:left w:val="single" w:color="CCCCCC" w:sz="1"/>
+              <w:bottom w:val="single" w:color="CCCCCC" w:sz="1"/>
+              <w:right w:val="single" w:color="CCCCCC" w:sz="1"/>
+            </w:tcBorders>
+            <w:shd w:fill="FFFFFF" w:val="clear"/>
+            <w:tcMar>
+              <w:top w:type="dxa" w:w="80"/>
+              <w:left w:type="dxa" w:w="120"/>
+              <w:bottom w:type="dxa" w:w="80"/>
+              <w:right w:type="dxa" w:w="120"/>
+            </w:tcMar>
+          </w:tcPr>
+          <w:p>
+            <w:pPr>
+              <w:spacing w:after="0"/>
+            </w:pPr>
+            <w:r>
+              <w:rPr>
+                <w:sz w:val="18"/>
+                <w:szCs w:val="18"/>
+              </w:rPr>
+              <w:t xml:space="preserve">aaa-management-ui</w:t>
+            </w:r>
+          </w:p>
+        </w:tc>
+        <w:tc>
+          <w:tcPr>
+            <w:tcW w:type="dxa" w:w="3760"/>
+            <w:tcBorders>
+              <w:top w:val="single" w:color="CCCCCC" w:sz="1"/>
+              <w:left w:val="single" w:color="CCCCCC" w:sz="1"/>
+              <w:bottom w:val="single" w:color="CCCCCC" w:sz="1"/>
+              <w:right w:val="single" w:color="CCCCCC" w:sz="1"/>
+            </w:tcBorders>
+            <w:shd w:fill="FFFFFF" w:val="clear"/>
+            <w:tcMar>
+              <w:top w:type="dxa" w:w="80"/>
+              <w:left w:type="dxa" w:w="120"/>
+              <w:bottom w:type="dxa" w:w="80"/>
+              <w:right w:type="dxa" w:w="120"/>
+            </w:tcMar>
+          </w:tcPr>
+          <w:p>
+            <w:pPr>
+              <w:spacing w:after="0"/>
+            </w:pPr>
+            <w:r>
+              <w:rPr>
+                <w:sz w:val="18"/>
+                <w:szCs w:val="18"/>
+              </w:rPr>
+              <w:t xml:space="preserve">Operator dashboard</w:t>
+            </w:r>
+          </w:p>
+        </w:tc>
+      </w:tr>
+      <w:tr>
+        <w:tc>
+          <w:tcPr>
+            <w:tcW w:type="dxa" w:w="3200"/>
+            <w:tcBorders>
+              <w:top w:val="single" w:color="CCCCCC" w:sz="1"/>
+              <w:left w:val="single" w:color="CCCCCC" w:sz="1"/>
+              <w:bottom w:val="single" w:color="CCCCCC" w:sz="1"/>
+              <w:right w:val="single" w:color="CCCCCC" w:sz="1"/>
+            </w:tcBorders>
+            <w:shd w:fill="F2F2F2" w:val="clear"/>
+            <w:tcMar>
+              <w:top w:type="dxa" w:w="80"/>
+              <w:left w:type="dxa" w:w="120"/>
+              <w:bottom w:type="dxa" w:w="80"/>
+              <w:right w:type="dxa" w:w="120"/>
+            </w:tcMar>
+          </w:tcPr>
+          <w:p>
+            <w:pPr>
+              <w:spacing w:after="0"/>
+            </w:pPr>
+            <w:r>
+              <w:rPr>
+                <w:sz w:val="18"/>
+                <w:szCs w:val="18"/>
+              </w:rPr>
+              <w:t xml:space="preserve">http://provisioning.aaa.localhost/v1</w:t>
+            </w:r>
+          </w:p>
+        </w:tc>
+        <w:tc>
+          <w:tcPr>
+            <w:tcW w:type="dxa" w:w="2400"/>
+            <w:tcBorders>
+              <w:top w:val="single" w:color="CCCCCC" w:sz="1"/>
+              <w:left w:val="single" w:color="CCCCCC" w:sz="1"/>
+              <w:bottom w:val="single" w:color="CCCCCC" w:sz="1"/>
+              <w:right w:val="single" w:color="CCCCCC" w:sz="1"/>
+            </w:tcBorders>
+            <w:shd w:fill="F2F2F2" w:val="clear"/>
+            <w:tcMar>
+              <w:top w:type="dxa" w:w="80"/>
+              <w:left w:type="dxa" w:w="120"/>
+              <w:bottom w:type="dxa" w:w="80"/>
+              <w:right w:type="dxa" w:w="120"/>
+            </w:tcMar>
+          </w:tcPr>
+          <w:p>
+            <w:pPr>
+              <w:spacing w:after="0"/>
+            </w:pPr>
+            <w:r>
+              <w:rPr>
+                <w:sz w:val="18"/>
+                <w:szCs w:val="18"/>
+              </w:rPr>
+              <w:t xml:space="preserve">subscriber-profile-api</w:t>
+            </w:r>
+          </w:p>
+        </w:tc>
+        <w:tc>
+          <w:tcPr>
+            <w:tcW w:type="dxa" w:w="3760"/>
+            <w:tcBorders>
+              <w:top w:val="single" w:color="CCCCCC" w:sz="1"/>
+              <w:left w:val="single" w:color="CCCCCC" w:sz="1"/>
+              <w:bottom w:val="single" w:color="CCCCCC" w:sz="1"/>
+              <w:right w:val="single" w:color="CCCCCC" w:sz="1"/>
+            </w:tcBorders>
+            <w:shd w:fill="F2F2F2" w:val="clear"/>
+            <w:tcMar>
+              <w:top w:type="dxa" w:w="80"/>
+              <w:left w:type="dxa" w:w="120"/>
+              <w:bottom w:type="dxa" w:w="80"/>
+              <w:right w:type="dxa" w:w="120"/>
+            </w:tcMar>
+          </w:tcPr>
+          <w:p>
+            <w:pPr>
+              <w:spacing w:after="0"/>
+            </w:pPr>
+            <w:r>
+              <w:rPr>
+                <w:sz w:val="18"/>
+                <w:szCs w:val="18"/>
+              </w:rPr>
+              <w:t xml:space="preserve">Provisioning REST API</w:t>
+            </w:r>
+          </w:p>
+        </w:tc>
+      </w:tr>
+      <w:tr>
+        <w:tc>
+          <w:tcPr>
+            <w:tcW w:type="dxa" w:w="3200"/>
+            <w:tcBorders>
+              <w:top w:val="single" w:color="CCCCCC" w:sz="1"/>
+              <w:left w:val="single" w:color="CCCCCC" w:sz="1"/>
+              <w:bottom w:val="single" w:color="CCCCCC" w:sz="1"/>
+              <w:right w:val="single" w:color="CCCCCC" w:sz="1"/>
+            </w:tcBorders>
+            <w:shd w:fill="FFFFFF" w:val="clear"/>
+            <w:tcMar>
+              <w:top w:type="dxa" w:w="80"/>
+              <w:left w:type="dxa" w:w="120"/>
+              <w:bottom w:type="dxa" w:w="80"/>
+              <w:right w:type="dxa" w:w="120"/>
+            </w:tcMar>
+          </w:tcPr>
+          <w:p>
+            <w:pPr>
+              <w:spacing w:after="0"/>
+            </w:pPr>
+            <w:r>
+              <w:rPr>
+                <w:sz w:val="18"/>
+                <w:szCs w:val="18"/>
+              </w:rPr>
+              <w:t xml:space="preserve">http://lookup.aaa.localhost/health</w:t>
+            </w:r>
+          </w:p>
+        </w:tc>
+        <w:tc>
+          <w:tcPr>
+            <w:tcW w:type="dxa" w:w="2400"/>
+            <w:tcBorders>
+              <w:top w:val="single" w:color="CCCCCC" w:sz="1"/>
+              <w:left w:val="single" w:color="CCCCCC" w:sz="1"/>
+              <w:bottom w:val="single" w:color="CCCCCC" w:sz="1"/>
+              <w:right w:val="single" w:color="CCCCCC" w:sz="1"/>
+            </w:tcBorders>
+            <w:shd w:fill="FFFFFF" w:val="clear"/>
+            <w:tcMar>
+              <w:top w:type="dxa" w:w="80"/>
+              <w:left w:type="dxa" w:w="120"/>
+              <w:bottom w:type="dxa" w:w="80"/>
+              <w:right w:type="dxa" w:w="120"/>
+            </w:tcMar>
+          </w:tcPr>
+          <w:p>
+            <w:pPr>
+              <w:spacing w:after="0"/>
+            </w:pPr>
+            <w:r>
+              <w:rPr>
+                <w:sz w:val="18"/>
+                <w:szCs w:val="18"/>
+              </w:rPr>
+              <w:t xml:space="preserve">aaa-lookup-service</w:t>
+            </w:r>
+          </w:p>
+        </w:tc>
+        <w:tc>
+          <w:tcPr>
+            <w:tcW w:type="dxa" w:w="3760"/>
+            <w:tcBorders>
+              <w:top w:val="single" w:color="CCCCCC" w:sz="1"/>
+              <w:left w:val="single" w:color="CCCCCC" w:sz="1"/>
+              <w:bottom w:val="single" w:color="CCCCCC" w:sz="1"/>
+              <w:right w:val="single" w:color="CCCCCC" w:sz="1"/>
+            </w:tcBorders>
+            <w:shd w:fill="FFFFFF" w:val="clear"/>
+            <w:tcMar>
+              <w:top w:type="dxa" w:w="80"/>
+              <w:left w:type="dxa" w:w="120"/>
+              <w:bottom w:type="dxa" w:w="80"/>
+              <w:right w:type="dxa" w:w="120"/>
+            </w:tcMar>
+          </w:tcPr>
+          <w:p>
+            <w:pPr>
+              <w:spacing w:after="0"/>
+            </w:pPr>
+            <w:r>
+              <w:rPr>
+                <w:sz w:val="18"/>
+                <w:szCs w:val="18"/>
+              </w:rPr>
+              <w:t xml:space="preserve">Health endpoint</w:t>
+            </w:r>
+          </w:p>
+        </w:tc>
+      </w:tr>
+      <w:tr>
+        <w:tc>
+          <w:tcPr>
+            <w:tcW w:type="dxa" w:w="3200"/>
+            <w:tcBorders>
+              <w:top w:val="single" w:color="CCCCCC" w:sz="1"/>
+              <w:left w:val="single" w:color="CCCCCC" w:sz="1"/>
+              <w:bottom w:val="single" w:color="CCCCCC" w:sz="1"/>
+              <w:right w:val="single" w:color="CCCCCC" w:sz="1"/>
+            </w:tcBorders>
+            <w:shd w:fill="F2F2F2" w:val="clear"/>
+            <w:tcMar>
+              <w:top w:type="dxa" w:w="80"/>
+              <w:left w:type="dxa" w:w="120"/>
+              <w:bottom w:type="dxa" w:w="80"/>
+              <w:right w:type="dxa" w:w="120"/>
+            </w:tcMar>
+          </w:tcPr>
+          <w:p>
+            <w:pPr>
+              <w:spacing w:after="0"/>
+            </w:pPr>
+            <w:r>
+              <w:rPr>
+                <w:sz w:val="18"/>
+                <w:szCs w:val="18"/>
+              </w:rPr>
+              <w:t xml:space="preserve">http://grafana.aaa.localhost</w:t>
+            </w:r>
+          </w:p>
+        </w:tc>
+        <w:tc>
+          <w:tcPr>
+            <w:tcW w:type="dxa" w:w="2400"/>
+            <w:tcBorders>
+              <w:top w:val="single" w:color="CCCCCC" w:sz="1"/>
+              <w:left w:val="single" w:color="CCCCCC" w:sz="1"/>
+              <w:bottom w:val="single" w:color="CCCCCC" w:sz="1"/>
+              <w:right w:val="single" w:color="CCCCCC" w:sz="1"/>
+            </w:tcBorders>
+            <w:shd w:fill="F2F2F2" w:val="clear"/>
+            <w:tcMar>
+              <w:top w:type="dxa" w:w="80"/>
+              <w:left w:type="dxa" w:w="120"/>
+              <w:bottom w:type="dxa" w:w="80"/>
+              <w:right w:type="dxa" w:w="120"/>
+            </w:tcMar>
+          </w:tcPr>
+          <w:p>
+            <w:pPr>
+              <w:spacing w:after="0"/>
+            </w:pPr>
+            <w:r>
+              <w:rPr>
+                <w:sz w:val="18"/>
+                <w:szCs w:val="18"/>
+              </w:rPr>
+              <w:t xml:space="preserve">Grafana</w:t>
+            </w:r>
+          </w:p>
+        </w:tc>
+        <w:tc>
+          <w:tcPr>
+            <w:tcW w:type="dxa" w:w="3760"/>
+            <w:tcBorders>
+              <w:top w:val="single" w:color="CCCCCC" w:sz="1"/>
+              <w:left w:val="single" w:color="CCCCCC" w:sz="1"/>
+              <w:bottom w:val="single" w:color="CCCCCC" w:sz="1"/>
+              <w:right w:val="single" w:color="CCCCCC" w:sz="1"/>
+            </w:tcBorders>
+            <w:shd w:fill="F2F2F2" w:val="clear"/>
+            <w:tcMar>
+              <w:top w:type="dxa" w:w="80"/>
+              <w:left w:type="dxa" w:w="120"/>
+              <w:bottom w:type="dxa" w:w="80"/>
+              <w:right w:type="dxa" w:w="120"/>
+            </w:tcMar>
+          </w:tcPr>
+          <w:p>
+            <w:pPr>
+              <w:spacing w:after="0"/>
+            </w:pPr>
+            <w:r>
+              <w:rPr>
+                <w:sz w:val="18"/>
+                <w:szCs w:val="18"/>
+              </w:rPr>
+              <w:t xml:space="preserve">admin / dev-grafana (dev mode)</w:t>
+            </w:r>
+          </w:p>
+        </w:tc>
+      </w:tr>
+      <w:tr>
+        <w:tc>
+          <w:tcPr>
+            <w:tcW w:type="dxa" w:w="3200"/>
+            <w:tcBorders>
+              <w:top w:val="single" w:color="CCCCCC" w:sz="1"/>
+              <w:left w:val="single" w:color="CCCCCC" w:sz="1"/>
+              <w:bottom w:val="single" w:color="CCCCCC" w:sz="1"/>
+              <w:right w:val="single" w:color="CCCCCC" w:sz="1"/>
+            </w:tcBorders>
+            <w:shd w:fill="FFFFFF" w:val="clear"/>
+            <w:tcMar>
+              <w:top w:type="dxa" w:w="80"/>
+              <w:left w:type="dxa" w:w="120"/>
+              <w:bottom w:type="dxa" w:w="80"/>
+              <w:right w:type="dxa" w:w="120"/>
+            </w:tcMar>
+          </w:tcPr>
+          <w:p>
+            <w:pPr>
+              <w:spacing w:after="0"/>
+            </w:pPr>
+            <w:r>
+              <w:rPr>
+                <w:sz w:val="18"/>
+                <w:szCs w:val="18"/>
+              </w:rPr>
+              <w:t xml:space="preserve">http://prometheus.aaa.localhost</w:t>
+            </w:r>
+          </w:p>
+        </w:tc>
+        <w:tc>
+          <w:tcPr>
+            <w:tcW w:type="dxa" w:w="2400"/>
+            <w:tcBorders>
+              <w:top w:val="single" w:color="CCCCCC" w:sz="1"/>
+              <w:left w:val="single" w:color="CCCCCC" w:sz="1"/>
+              <w:bottom w:val="single" w:color="CCCCCC" w:sz="1"/>
+              <w:right w:val="single" w:color="CCCCCC" w:sz="1"/>
+            </w:tcBorders>
+            <w:shd w:fill="FFFFFF" w:val="clear"/>
+            <w:tcMar>
+              <w:top w:type="dxa" w:w="80"/>
+              <w:left w:type="dxa" w:w="120"/>
+              <w:bottom w:type="dxa" w:w="80"/>
+              <w:right w:type="dxa" w:w="120"/>
+            </w:tcMar>
+          </w:tcPr>
+          <w:p>
+            <w:pPr>
+              <w:spacing w:after="0"/>
+            </w:pPr>
+            <w:r>
+              <w:rPr>
+                <w:sz w:val="18"/>
+                <w:szCs w:val="18"/>
+              </w:rPr>
+              <w:t xml:space="preserve">Prometheus</w:t>
+            </w:r>
+          </w:p>
+        </w:tc>
+        <w:tc>
+          <w:tcPr>
+            <w:tcW w:type="dxa" w:w="3760"/>
+            <w:tcBorders>
+              <w:top w:val="single" w:color="CCCCCC" w:sz="1"/>
+              <w:left w:val="single" w:color="CCCCCC" w:sz="1"/>
+              <w:bottom w:val="single" w:color="CCCCCC" w:sz="1"/>
+              <w:right w:val="single" w:color="CCCCCC" w:sz="1"/>
+            </w:tcBorders>
+            <w:shd w:fill="FFFFFF" w:val="clear"/>
+            <w:tcMar>
+              <w:top w:type="dxa" w:w="80"/>
+              <w:left w:type="dxa" w:w="120"/>
+              <w:bottom w:type="dxa" w:w="80"/>
+              <w:right w:type="dxa" w:w="120"/>
+            </w:tcMar>
+          </w:tcPr>
+          <w:p>
+            <w:pPr>
+              <w:spacing w:after="0"/>
+            </w:pPr>
+            <w:r>
+              <w:rPr>
+                <w:sz w:val="18"/>
+                <w:szCs w:val="18"/>
+              </w:rPr>
+              <w:t xml:space="preserve">Metrics scrape target browser</w:t>
+            </w:r>
+          </w:p>
+        </w:tc>
+      </w:tr>
+    </w:tbl>
+    <w:p>
+      <w:pPr>
+        <w:spacing w:after="80"/>
+      </w:pPr>
+    </w:p>
+    <w:p>
+      <w:pPr>
+        <w:pStyle w:val="Heading2"/>
+      </w:pPr>
+      <w:r>
+        <w:t xml:space="preserve">1.7 Port Forwards (Alternative to Ingress)</w:t>
+      </w:r>
+    </w:p>
+    <w:p>
+      <w:pPr>
+        <w:spacing w:after="120"/>
+      </w:pPr>
+      <w:r>
+        <w:t xml:space="preserve">If you prefer direct port-forward access (e.g., for debugging or when Ingress is not configured):</w:t>
+      </w:r>
+    </w:p>
+    <w:tbl>
+      <w:tblPr>
+        <w:tblW w:type="dxa" w:w="9360"/>
+        <w:tblBorders>
+          <w:top w:val="single" w:color="auto" w:sz="4"/>
+          <w:left w:val="single" w:color="auto" w:sz="4"/>
+          <w:bottom w:val="single" w:color="auto" w:sz="4"/>
+          <w:right w:val="single" w:color="auto" w:sz="4"/>
+          <w:insideH w:val="single" w:color="auto" w:sz="4"/>
+          <w:insideV w:val="single" w:color="auto" w:sz="4"/>
+        </w:tblBorders>
+      </w:tblPr>
+      <w:tblGrid>
+        <w:gridCol w:w="3200"/>
+        <w:gridCol w:w="1600"/>
+        <w:gridCol w:w="4560"/>
+      </w:tblGrid>
+      <w:tr>
+        <w:trPr>
+          <w:tblHeader/>
+        </w:trPr>
+        <w:tc>
+          <w:tcPr>
+            <w:tcW w:type="dxa" w:w="3200"/>
+            <w:tcBorders>
+              <w:top w:val="single" w:color="CCCCCC" w:sz="1"/>
+              <w:left w:val="single" w:color="CCCCCC" w:sz="1"/>
+              <w:bottom w:val="single" w:color="CCCCCC" w:sz="1"/>
+              <w:right w:val="single" w:color="CCCCCC" w:sz="1"/>
+            </w:tcBorders>
+            <w:shd w:fill="2E75B6" w:val="clear"/>
+            <w:tcMar>
+              <w:top w:type="dxa" w:w="80"/>
+              <w:left w:type="dxa" w:w="120"/>
+              <w:bottom w:type="dxa" w:w="80"/>
+              <w:right w:type="dxa" w:w="120"/>
+            </w:tcMar>
+          </w:tcPr>
+          <w:p>
+            <w:pPr>
+              <w:spacing w:after="0"/>
+            </w:pPr>
+            <w:r>
+              <w:rPr>
+                <w:b/>
+                <w:bCs/>
+                <w:color w:val="FFFFFF"/>
+                <w:sz w:val="18"/>
+                <w:szCs w:val="18"/>
+              </w:rPr>
+              <w:t xml:space="preserve">Command</w:t>
+            </w:r>
+          </w:p>
+        </w:tc>
+        <w:tc>
+          <w:tcPr>
+            <w:tcW w:type="dxa" w:w="1600"/>
+            <w:tcBorders>
+              <w:top w:val="single" w:color="CCCCCC" w:sz="1"/>
+              <w:left w:val="single" w:color="CCCCCC" w:sz="1"/>
+              <w:bottom w:val="single" w:color="CCCCCC" w:sz="1"/>
+              <w:right w:val="single" w:color="CCCCCC" w:sz="1"/>
+            </w:tcBorders>
+            <w:shd w:fill="2E75B6" w:val="clear"/>
+            <w:tcMar>
+              <w:top w:type="dxa" w:w="80"/>
+              <w:left w:type="dxa" w:w="120"/>
+              <w:bottom w:type="dxa" w:w="80"/>
+              <w:right w:type="dxa" w:w="120"/>
+            </w:tcMar>
+          </w:tcPr>
+          <w:p>
+            <w:pPr>
+              <w:spacing w:after="0"/>
+            </w:pPr>
+            <w:r>
+              <w:rPr>
+                <w:b/>
+                <w:bCs/>
+                <w:color w:val="FFFFFF"/>
+                <w:sz w:val="18"/>
+                <w:szCs w:val="18"/>
+              </w:rPr>
+              <w:t xml:space="preserve">Local Port</w:t>
+            </w:r>
+          </w:p>
+        </w:tc>
+        <w:tc>
+          <w:tcPr>
+            <w:tcW w:type="dxa" w:w="4560"/>
+            <w:tcBorders>
+              <w:top w:val="single" w:color="CCCCCC" w:sz="1"/>
+              <w:left w:val="single" w:color="CCCCCC" w:sz="1"/>
+              <w:bottom w:val="single" w:color="CCCCCC" w:sz="1"/>
+              <w:right w:val="single" w:color="CCCCCC" w:sz="1"/>
+            </w:tcBorders>
+            <w:shd w:fill="2E75B6" w:val="clear"/>
+            <w:tcMar>
+              <w:top w:type="dxa" w:w="80"/>
+              <w:left w:type="dxa" w:w="120"/>
+              <w:bottom w:type="dxa" w:w="80"/>
+              <w:right w:type="dxa" w:w="120"/>
+            </w:tcMar>
+          </w:tcPr>
+          <w:p>
+            <w:pPr>
+              <w:spacing w:after="0"/>
+            </w:pPr>
+            <w:r>
+              <w:rPr>
+                <w:b/>
+                <w:bCs/>
+                <w:color w:val="FFFFFF"/>
+                <w:sz w:val="18"/>
+                <w:szCs w:val="18"/>
+              </w:rPr>
+              <w:t xml:space="preserve">Service</w:t>
+            </w:r>
+          </w:p>
+        </w:tc>
+      </w:tr>
+      <w:tr>
+        <w:tc>
+          <w:tcPr>
+            <w:tcW w:type="dxa" w:w="3200"/>
+            <w:tcBorders>
+              <w:top w:val="single" w:color="CCCCCC" w:sz="1"/>
+              <w:left w:val="single" w:color="CCCCCC" w:sz="1"/>
+              <w:bottom w:val="single" w:color="CCCCCC" w:sz="1"/>
+              <w:right w:val="single" w:color="CCCCCC" w:sz="1"/>
+            </w:tcBorders>
+            <w:shd w:fill="FFFFFF" w:val="clear"/>
+            <w:tcMar>
+              <w:top w:type="dxa" w:w="80"/>
+              <w:left w:type="dxa" w:w="120"/>
+              <w:bottom w:type="dxa" w:w="80"/>
+              <w:right w:type="dxa" w:w="120"/>
+            </w:tcMar>
+          </w:tcPr>
+          <w:p>
+            <w:pPr>
+              <w:spacing w:after="0"/>
+            </w:pPr>
+            <w:r>
+              <w:rPr>
+                <w:sz w:val="18"/>
+                <w:szCs w:val="18"/>
+              </w:rPr>
+              <w:t xml:space="preserve">make port-forward-api</w:t>
+            </w:r>
+          </w:p>
+        </w:tc>
+        <w:tc>
+          <w:tcPr>
+            <w:tcW w:type="dxa" w:w="1600"/>
+            <w:tcBorders>
+              <w:top w:val="single" w:color="CCCCCC" w:sz="1"/>
+              <w:left w:val="single" w:color="CCCCCC" w:sz="1"/>
+              <w:bottom w:val="single" w:color="CCCCCC" w:sz="1"/>
+              <w:right w:val="single" w:color="CCCCCC" w:sz="1"/>
+            </w:tcBorders>
+            <w:shd w:fill="FFFFFF" w:val="clear"/>
+            <w:tcMar>
+              <w:top w:type="dxa" w:w="80"/>
+              <w:left w:type="dxa" w:w="120"/>
+              <w:bottom w:type="dxa" w:w="80"/>
+              <w:right w:type="dxa" w:w="120"/>
+            </w:tcMar>
+          </w:tcPr>
+          <w:p>
+            <w:pPr>
+              <w:spacing w:after="0"/>
+            </w:pPr>
+            <w:r>
+              <w:rPr>
+                <w:sz w:val="18"/>
+                <w:szCs w:val="18"/>
+              </w:rPr>
+              <w:t xml:space="preserve">8080</w:t>
+            </w:r>
+          </w:p>
+        </w:tc>
+        <w:tc>
+          <w:tcPr>
+            <w:tcW w:type="dxa" w:w="4560"/>
+            <w:tcBorders>
+              <w:top w:val="single" w:color="CCCCCC" w:sz="1"/>
+              <w:left w:val="single" w:color="CCCCCC" w:sz="1"/>
+              <w:bottom w:val="single" w:color="CCCCCC" w:sz="1"/>
+              <w:right w:val="single" w:color="CCCCCC" w:sz="1"/>
+            </w:tcBorders>
+            <w:shd w:fill="FFFFFF" w:val="clear"/>
+            <w:tcMar>
+              <w:top w:type="dxa" w:w="80"/>
+              <w:left w:type="dxa" w:w="120"/>
+              <w:bottom w:type="dxa" w:w="80"/>
+              <w:right w:type="dxa" w:w="120"/>
+            </w:tcMar>
+          </w:tcPr>
+          <w:p>
+            <w:pPr>
+              <w:spacing w:after="0"/>
+            </w:pPr>
+            <w:r>
+              <w:rPr>
+                <w:sz w:val="18"/>
+                <w:szCs w:val="18"/>
+              </w:rPr>
+              <w:t xml:space="preserve">subscriber-profile-api</w:t>
+            </w:r>
+          </w:p>
+        </w:tc>
+      </w:tr>
+      <w:tr>
+        <w:tc>
+          <w:tcPr>
+            <w:tcW w:type="dxa" w:w="3200"/>
+            <w:tcBorders>
+              <w:top w:val="single" w:color="CCCCCC" w:sz="1"/>
+              <w:left w:val="single" w:color="CCCCCC" w:sz="1"/>
+              <w:bottom w:val="single" w:color="CCCCCC" w:sz="1"/>
+              <w:right w:val="single" w:color="CCCCCC" w:sz="1"/>
+            </w:tcBorders>
+            <w:shd w:fill="F2F2F2" w:val="clear"/>
+            <w:tcMar>
+              <w:top w:type="dxa" w:w="80"/>
+              <w:left w:type="dxa" w:w="120"/>
+              <w:bottom w:type="dxa" w:w="80"/>
+              <w:right w:type="dxa" w:w="120"/>
+            </w:tcMar>
+          </w:tcPr>
+          <w:p>
+            <w:pPr>
+              <w:spacing w:after="0"/>
+            </w:pPr>
+            <w:r>
+              <w:rPr>
+                <w:sz w:val="18"/>
+                <w:szCs w:val="18"/>
+              </w:rPr>
+              <w:t xml:space="preserve">make port-forward-lookup</w:t>
+            </w:r>
+          </w:p>
+        </w:tc>
+        <w:tc>
+          <w:tcPr>
+            <w:tcW w:type="dxa" w:w="1600"/>
+            <w:tcBorders>
+              <w:top w:val="single" w:color="CCCCCC" w:sz="1"/>
+              <w:left w:val="single" w:color="CCCCCC" w:sz="1"/>
+              <w:bottom w:val="single" w:color="CCCCCC" w:sz="1"/>
+              <w:right w:val="single" w:color="CCCCCC" w:sz="1"/>
+            </w:tcBorders>
+            <w:shd w:fill="F2F2F2" w:val="clear"/>
+            <w:tcMar>
+              <w:top w:type="dxa" w:w="80"/>
+              <w:left w:type="dxa" w:w="120"/>
+              <w:bottom w:type="dxa" w:w="80"/>
+              <w:right w:type="dxa" w:w="120"/>
+            </w:tcMar>
+          </w:tcPr>
+          <w:p>
+            <w:pPr>
+              <w:spacing w:after="0"/>
+            </w:pPr>
+            <w:r>
+              <w:rPr>
+                <w:sz w:val="18"/>
+                <w:szCs w:val="18"/>
+              </w:rPr>
+              <w:t xml:space="preserve">8081</w:t>
+            </w:r>
+          </w:p>
+        </w:tc>
+        <w:tc>
+          <w:tcPr>
+            <w:tcW w:type="dxa" w:w="4560"/>
+            <w:tcBorders>
+              <w:top w:val="single" w:color="CCCCCC" w:sz="1"/>
+              <w:left w:val="single" w:color="CCCCCC" w:sz="1"/>
+              <w:bottom w:val="single" w:color="CCCCCC" w:sz="1"/>
+              <w:right w:val="single" w:color="CCCCCC" w:sz="1"/>
+            </w:tcBorders>
+            <w:shd w:fill="F2F2F2" w:val="clear"/>
+            <w:tcMar>
+              <w:top w:type="dxa" w:w="80"/>
+              <w:left w:type="dxa" w:w="120"/>
+              <w:bottom w:type="dxa" w:w="80"/>
+              <w:right w:type="dxa" w:w="120"/>
+            </w:tcMar>
+          </w:tcPr>
+          <w:p>
+            <w:pPr>
+              <w:spacing w:after="0"/>
+            </w:pPr>
+            <w:r>
+              <w:rPr>
+                <w:sz w:val="18"/>
+                <w:szCs w:val="18"/>
+              </w:rPr>
+              <w:t xml:space="preserve">aaa-lookup-service</w:t>
+            </w:r>
+          </w:p>
+        </w:tc>
+      </w:tr>
+      <w:tr>
+        <w:tc>
+          <w:tcPr>
+            <w:tcW w:type="dxa" w:w="3200"/>
+            <w:tcBorders>
+              <w:top w:val="single" w:color="CCCCCC" w:sz="1"/>
+              <w:left w:val="single" w:color="CCCCCC" w:sz="1"/>
+              <w:bottom w:val="single" w:color="CCCCCC" w:sz="1"/>
+              <w:right w:val="single" w:color="CCCCCC" w:sz="1"/>
+            </w:tcBorders>
+            <w:shd w:fill="FFFFFF" w:val="clear"/>
+            <w:tcMar>
+              <w:top w:type="dxa" w:w="80"/>
+              <w:left w:type="dxa" w:w="120"/>
+              <w:bottom w:type="dxa" w:w="80"/>
+              <w:right w:type="dxa" w:w="120"/>
+            </w:tcMar>
+          </w:tcPr>
+          <w:p>
+            <w:pPr>
+              <w:spacing w:after="0"/>
+            </w:pPr>
+            <w:r>
+              <w:rPr>
+                <w:sz w:val="18"/>
+                <w:szCs w:val="18"/>
+              </w:rPr>
+              <w:t xml:space="preserve">make port-forward-db</w:t>
+            </w:r>
+          </w:p>
+        </w:tc>
+        <w:tc>
+          <w:tcPr>
+            <w:tcW w:type="dxa" w:w="1600"/>
+            <w:tcBorders>
+              <w:top w:val="single" w:color="CCCCCC" w:sz="1"/>
+              <w:left w:val="single" w:color="CCCCCC" w:sz="1"/>
+              <w:bottom w:val="single" w:color="CCCCCC" w:sz="1"/>
+              <w:right w:val="single" w:color="CCCCCC" w:sz="1"/>
+            </w:tcBorders>
+            <w:shd w:fill="FFFFFF" w:val="clear"/>
+            <w:tcMar>
+              <w:top w:type="dxa" w:w="80"/>
+              <w:left w:type="dxa" w:w="120"/>
+              <w:bottom w:type="dxa" w:w="80"/>
+              <w:right w:type="dxa" w:w="120"/>
+            </w:tcMar>
+          </w:tcPr>
+          <w:p>
+            <w:pPr>
+              <w:spacing w:after="0"/>
+            </w:pPr>
+            <w:r>
+              <w:rPr>
+                <w:sz w:val="18"/>
+                <w:szCs w:val="18"/>
+              </w:rPr>
+              <w:t xml:space="preserve">5432</w:t>
+            </w:r>
+          </w:p>
+        </w:tc>
+        <w:tc>
+          <w:tcPr>
+            <w:tcW w:type="dxa" w:w="4560"/>
+            <w:tcBorders>
+              <w:top w:val="single" w:color="CCCCCC" w:sz="1"/>
+              <w:left w:val="single" w:color="CCCCCC" w:sz="1"/>
+              <w:bottom w:val="single" w:color="CCCCCC" w:sz="1"/>
+              <w:right w:val="single" w:color="CCCCCC" w:sz="1"/>
+            </w:tcBorders>
+            <w:shd w:fill="FFFFFF" w:val="clear"/>
+            <w:tcMar>
+              <w:top w:type="dxa" w:w="80"/>
+              <w:left w:type="dxa" w:w="120"/>
+              <w:bottom w:type="dxa" w:w="80"/>
+              <w:right w:type="dxa" w:w="120"/>
+            </w:tcMar>
+          </w:tcPr>
+          <w:p>
+            <w:pPr>
+              <w:spacing w:after="0"/>
+            </w:pPr>
+            <w:r>
+              <w:rPr>
+                <w:sz w:val="18"/>
+                <w:szCs w:val="18"/>
+              </w:rPr>
+              <w:t xml:space="preserve">PostgreSQL (primary)</w:t>
+            </w:r>
+          </w:p>
+        </w:tc>
+      </w:tr>
+      <w:tr>
+        <w:tc>
+          <w:tcPr>
+            <w:tcW w:type="dxa" w:w="3200"/>
+            <w:tcBorders>
+              <w:top w:val="single" w:color="CCCCCC" w:sz="1"/>
+              <w:left w:val="single" w:color="CCCCCC" w:sz="1"/>
+              <w:bottom w:val="single" w:color="CCCCCC" w:sz="1"/>
+              <w:right w:val="single" w:color="CCCCCC" w:sz="1"/>
+            </w:tcBorders>
+            <w:shd w:fill="F2F2F2" w:val="clear"/>
+            <w:tcMar>
+              <w:top w:type="dxa" w:w="80"/>
+              <w:left w:type="dxa" w:w="120"/>
+              <w:bottom w:type="dxa" w:w="80"/>
+              <w:right w:type="dxa" w:w="120"/>
+            </w:tcMar>
+          </w:tcPr>
+          <w:p>
+            <w:pPr>
+              <w:spacing w:after="0"/>
+            </w:pPr>
+            <w:r>
+              <w:rPr>
+                <w:sz w:val="18"/>
+                <w:szCs w:val="18"/>
+              </w:rPr>
+              <w:t xml:space="preserve">make port-forward-ui</w:t>
+            </w:r>
+          </w:p>
+        </w:tc>
+        <w:tc>
+          <w:tcPr>
+            <w:tcW w:type="dxa" w:w="1600"/>
+            <w:tcBorders>
+              <w:top w:val="single" w:color="CCCCCC" w:sz="1"/>
+              <w:left w:val="single" w:color="CCCCCC" w:sz="1"/>
+              <w:bottom w:val="single" w:color="CCCCCC" w:sz="1"/>
+              <w:right w:val="single" w:color="CCCCCC" w:sz="1"/>
+            </w:tcBorders>
+            <w:shd w:fill="F2F2F2" w:val="clear"/>
+            <w:tcMar>
+              <w:top w:type="dxa" w:w="80"/>
+              <w:left w:type="dxa" w:w="120"/>
+              <w:bottom w:type="dxa" w:w="80"/>
+              <w:right w:type="dxa" w:w="120"/>
+            </w:tcMar>
+          </w:tcPr>
+          <w:p>
+            <w:pPr>
+              <w:spacing w:after="0"/>
+            </w:pPr>
+            <w:r>
+              <w:rPr>
+                <w:sz w:val="18"/>
+                <w:szCs w:val="18"/>
+              </w:rPr>
+              <w:t xml:space="preserve">8090</w:t>
+            </w:r>
+          </w:p>
+        </w:tc>
+        <w:tc>
+          <w:tcPr>
+            <w:tcW w:type="dxa" w:w="4560"/>
+            <w:tcBorders>
+              <w:top w:val="single" w:color="CCCCCC" w:sz="1"/>
+              <w:left w:val="single" w:color="CCCCCC" w:sz="1"/>
+              <w:bottom w:val="single" w:color="CCCCCC" w:sz="1"/>
+              <w:right w:val="single" w:color="CCCCCC" w:sz="1"/>
+            </w:tcBorders>
+            <w:shd w:fill="F2F2F2" w:val="clear"/>
+            <w:tcMar>
+              <w:top w:type="dxa" w:w="80"/>
+              <w:left w:type="dxa" w:w="120"/>
+              <w:bottom w:type="dxa" w:w="80"/>
+              <w:right w:type="dxa" w:w="120"/>
+            </w:tcMar>
+          </w:tcPr>
+          <w:p>
+            <w:pPr>
+              <w:spacing w:after="0"/>
+            </w:pPr>
+            <w:r>
+              <w:rPr>
+                <w:sz w:val="18"/>
+                <w:szCs w:val="18"/>
+              </w:rPr>
+              <w:t xml:space="preserve">aaa-management-ui</w:t>
+            </w:r>
+          </w:p>
+        </w:tc>
+      </w:tr>
+      <w:tr>
+        <w:tc>
+          <w:tcPr>
+            <w:tcW w:type="dxa" w:w="3200"/>
+            <w:tcBorders>
+              <w:top w:val="single" w:color="CCCCCC" w:sz="1"/>
+              <w:left w:val="single" w:color="CCCCCC" w:sz="1"/>
+              <w:bottom w:val="single" w:color="CCCCCC" w:sz="1"/>
+              <w:right w:val="single" w:color="CCCCCC" w:sz="1"/>
+            </w:tcBorders>
+            <w:shd w:fill="FFFFFF" w:val="clear"/>
+            <w:tcMar>
+              <w:top w:type="dxa" w:w="80"/>
+              <w:left w:type="dxa" w:w="120"/>
+              <w:bottom w:type="dxa" w:w="80"/>
+              <w:right w:type="dxa" w:w="120"/>
+            </w:tcMar>
+          </w:tcPr>
+          <w:p>
+            <w:pPr>
+              <w:spacing w:after="0"/>
+            </w:pPr>
+            <w:r>
+              <w:rPr>
+                <w:sz w:val="18"/>
+                <w:szCs w:val="18"/>
+              </w:rPr>
+              <w:t xml:space="preserve">make port-forward-grafana</w:t>
+            </w:r>
+          </w:p>
+        </w:tc>
+        <w:tc>
+          <w:tcPr>
+            <w:tcW w:type="dxa" w:w="1600"/>
+            <w:tcBorders>
+              <w:top w:val="single" w:color="CCCCCC" w:sz="1"/>
+              <w:left w:val="single" w:color="CCCCCC" w:sz="1"/>
+              <w:bottom w:val="single" w:color="CCCCCC" w:sz="1"/>
+              <w:right w:val="single" w:color="CCCCCC" w:sz="1"/>
+            </w:tcBorders>
+            <w:shd w:fill="FFFFFF" w:val="clear"/>
+            <w:tcMar>
+              <w:top w:type="dxa" w:w="80"/>
+              <w:left w:type="dxa" w:w="120"/>
+              <w:bottom w:type="dxa" w:w="80"/>
+              <w:right w:type="dxa" w:w="120"/>
+            </w:tcMar>
+          </w:tcPr>
+          <w:p>
+            <w:pPr>
+              <w:spacing w:after="0"/>
+            </w:pPr>
+            <w:r>
+              <w:rPr>
+                <w:sz w:val="18"/>
+                <w:szCs w:val="18"/>
+              </w:rPr>
+              <w:t xml:space="preserve">3000</w:t>
+            </w:r>
+          </w:p>
+        </w:tc>
+        <w:tc>
+          <w:tcPr>
+            <w:tcW w:type="dxa" w:w="4560"/>
+            <w:tcBorders>
+              <w:top w:val="single" w:color="CCCCCC" w:sz="1"/>
+              <w:left w:val="single" w:color="CCCCCC" w:sz="1"/>
+              <w:bottom w:val="single" w:color="CCCCCC" w:sz="1"/>
+              <w:right w:val="single" w:color="CCCCCC" w:sz="1"/>
+            </w:tcBorders>
+            <w:shd w:fill="FFFFFF" w:val="clear"/>
+            <w:tcMar>
+              <w:top w:type="dxa" w:w="80"/>
+              <w:left w:type="dxa" w:w="120"/>
+              <w:bottom w:type="dxa" w:w="80"/>
+              <w:right w:type="dxa" w:w="120"/>
+            </w:tcMar>
+          </w:tcPr>
+          <w:p>
+            <w:pPr>
+              <w:spacing w:after="0"/>
+            </w:pPr>
+            <w:r>
+              <w:rPr>
+                <w:sz w:val="18"/>
+                <w:szCs w:val="18"/>
+              </w:rPr>
+              <w:t xml:space="preserve">Grafana</w:t>
+            </w:r>
+          </w:p>
+        </w:tc>
+      </w:tr>
+      <w:tr>
+        <w:tc>
+          <w:tcPr>
+            <w:tcW w:type="dxa" w:w="3200"/>
+            <w:tcBorders>
+              <w:top w:val="single" w:color="CCCCCC" w:sz="1"/>
+              <w:left w:val="single" w:color="CCCCCC" w:sz="1"/>
+              <w:bottom w:val="single" w:color="CCCCCC" w:sz="1"/>
+              <w:right w:val="single" w:color="CCCCCC" w:sz="1"/>
+            </w:tcBorders>
+            <w:shd w:fill="F2F2F2" w:val="clear"/>
+            <w:tcMar>
+              <w:top w:type="dxa" w:w="80"/>
+              <w:left w:type="dxa" w:w="120"/>
+              <w:bottom w:type="dxa" w:w="80"/>
+              <w:right w:type="dxa" w:w="120"/>
+            </w:tcMar>
+          </w:tcPr>
+          <w:p>
+            <w:pPr>
+              <w:spacing w:after="0"/>
+            </w:pPr>
+            <w:r>
+              <w:rPr>
+                <w:sz w:val="18"/>
+                <w:szCs w:val="18"/>
+              </w:rPr>
+              <w:t xml:space="preserve">make port-forward-prometheus</w:t>
+            </w:r>
+          </w:p>
+        </w:tc>
+        <w:tc>
+          <w:tcPr>
+            <w:tcW w:type="dxa" w:w="1600"/>
+            <w:tcBorders>
+              <w:top w:val="single" w:color="CCCCCC" w:sz="1"/>
+              <w:left w:val="single" w:color="CCCCCC" w:sz="1"/>
+              <w:bottom w:val="single" w:color="CCCCCC" w:sz="1"/>
+              <w:right w:val="single" w:color="CCCCCC" w:sz="1"/>
+            </w:tcBorders>
+            <w:shd w:fill="F2F2F2" w:val="clear"/>
+            <w:tcMar>
+              <w:top w:type="dxa" w:w="80"/>
+              <w:left w:type="dxa" w:w="120"/>
+              <w:bottom w:type="dxa" w:w="80"/>
+              <w:right w:type="dxa" w:w="120"/>
+            </w:tcMar>
+          </w:tcPr>
+          <w:p>
+            <w:pPr>
+              <w:spacing w:after="0"/>
+            </w:pPr>
+            <w:r>
+              <w:rPr>
+                <w:sz w:val="18"/>
+                <w:szCs w:val="18"/>
+              </w:rPr>
+              <w:t xml:space="preserve">9090</w:t>
+            </w:r>
+          </w:p>
+        </w:tc>
+        <w:tc>
+          <w:tcPr>
+            <w:tcW w:type="dxa" w:w="4560"/>
+            <w:tcBorders>
+              <w:top w:val="single" w:color="CCCCCC" w:sz="1"/>
+              <w:left w:val="single" w:color="CCCCCC" w:sz="1"/>
+              <w:bottom w:val="single" w:color="CCCCCC" w:sz="1"/>
+              <w:right w:val="single" w:color="CCCCCC" w:sz="1"/>
+            </w:tcBorders>
+            <w:shd w:fill="F2F2F2" w:val="clear"/>
+            <w:tcMar>
+              <w:top w:type="dxa" w:w="80"/>
+              <w:left w:type="dxa" w:w="120"/>
+              <w:bottom w:type="dxa" w:w="80"/>
+              <w:right w:type="dxa" w:w="120"/>
+            </w:tcMar>
+          </w:tcPr>
+          <w:p>
+            <w:pPr>
+              <w:spacing w:after="0"/>
+            </w:pPr>
+            <w:r>
+              <w:rPr>
+                <w:sz w:val="18"/>
+                <w:szCs w:val="18"/>
+              </w:rPr>
+              <w:t xml:space="preserve">Prometheus</w:t>
+            </w:r>
+          </w:p>
+        </w:tc>
+      </w:tr>
+      <w:tr>
+        <w:tc>
+          <w:tcPr>
+            <w:tcW w:type="dxa" w:w="3200"/>
+            <w:tcBorders>
+              <w:top w:val="single" w:color="CCCCCC" w:sz="1"/>
+              <w:left w:val="single" w:color="CCCCCC" w:sz="1"/>
+              <w:bottom w:val="single" w:color="CCCCCC" w:sz="1"/>
+              <w:right w:val="single" w:color="CCCCCC" w:sz="1"/>
+            </w:tcBorders>
+            <w:shd w:fill="FFFFFF" w:val="clear"/>
+            <w:tcMar>
+              <w:top w:type="dxa" w:w="80"/>
+              <w:left w:type="dxa" w:w="120"/>
+              <w:bottom w:type="dxa" w:w="80"/>
+              <w:right w:type="dxa" w:w="120"/>
+            </w:tcMar>
+          </w:tcPr>
+          <w:p>
+            <w:pPr>
+              <w:spacing w:after="0"/>
+            </w:pPr>
+            <w:r>
+              <w:rPr>
+                <w:sz w:val="18"/>
+                <w:szCs w:val="18"/>
+              </w:rPr>
+              <w:t xml:space="preserve">make port-forward-pgbouncer</w:t>
+            </w:r>
+          </w:p>
+        </w:tc>
+        <w:tc>
+          <w:tcPr>
+            <w:tcW w:type="dxa" w:w="1600"/>
+            <w:tcBorders>
+              <w:top w:val="single" w:color="CCCCCC" w:sz="1"/>
+              <w:left w:val="single" w:color="CCCCCC" w:sz="1"/>
+              <w:bottom w:val="single" w:color="CCCCCC" w:sz="1"/>
+              <w:right w:val="single" w:color="CCCCCC" w:sz="1"/>
+            </w:tcBorders>
+            <w:shd w:fill="FFFFFF" w:val="clear"/>
+            <w:tcMar>
+              <w:top w:type="dxa" w:w="80"/>
+              <w:left w:type="dxa" w:w="120"/>
+              <w:bottom w:type="dxa" w:w="80"/>
+              <w:right w:type="dxa" w:w="120"/>
+            </w:tcMar>
+          </w:tcPr>
+          <w:p>
+            <w:pPr>
+              <w:spacing w:after="0"/>
+            </w:pPr>
+            <w:r>
+              <w:rPr>
+                <w:sz w:val="18"/>
+                <w:szCs w:val="18"/>
+              </w:rPr>
+              <w:t xml:space="preserve">5432</w:t>
+            </w:r>
+          </w:p>
+        </w:tc>
+        <w:tc>
+          <w:tcPr>
+            <w:tcW w:type="dxa" w:w="4560"/>
+            <w:tcBorders>
+              <w:top w:val="single" w:color="CCCCCC" w:sz="1"/>
+              <w:left w:val="single" w:color="CCCCCC" w:sz="1"/>
+              <w:bottom w:val="single" w:color="CCCCCC" w:sz="1"/>
+              <w:right w:val="single" w:color="CCCCCC" w:sz="1"/>
+            </w:tcBorders>
+            <w:shd w:fill="FFFFFF" w:val="clear"/>
+            <w:tcMar>
+              <w:top w:type="dxa" w:w="80"/>
+              <w:left w:type="dxa" w:w="120"/>
+              <w:bottom w:type="dxa" w:w="80"/>
+              <w:right w:type="dxa" w:w="120"/>
+            </w:tcMar>
+          </w:tcPr>
+          <w:p>
+            <w:pPr>
+              <w:spacing w:after="0"/>
+            </w:pPr>
+            <w:r>
+              <w:rPr>
+                <w:sz w:val="18"/>
+                <w:szCs w:val="18"/>
+              </w:rPr>
+              <w:t xml:space="preserve">PgBouncer connection pooler</w:t>
+            </w:r>
+          </w:p>
+        </w:tc>
+      </w:tr>
+    </w:tbl>
+    <w:p>
+      <w:pPr>
+        <w:spacing w:after="60"/>
+      </w:pPr>
+    </w:p>
+    <w:tbl>
+      <w:tblPr>
+        <w:tblW w:type="dxa" w:w="9360"/>
+        <w:tblBorders>
+          <w:top w:val="single" w:color="auto" w:sz="4"/>
+          <w:left w:val="single" w:color="auto" w:sz="4"/>
+          <w:bottom w:val="single" w:color="auto" w:sz="4"/>
+          <w:right w:val="single" w:color="auto" w:sz="4"/>
+          <w:insideH w:val="single" w:color="auto" w:sz="4"/>
+          <w:insideV w:val="single" w:color="auto" w:sz="4"/>
+        </w:tblBorders>
+      </w:tblPr>
+      <w:tblGrid>
+        <w:gridCol w:w="9360"/>
+      </w:tblGrid>
+      <w:tr>
+        <w:tc>
+          <w:tcPr>
+            <w:tcW w:type="dxa" w:w="9360"/>
+            <w:tcBorders>
+              <w:top w:val="single" w:color="CCCCCC" w:sz="1"/>
+              <w:left w:val="single" w:color="2E75B6" w:sz="8"/>
+              <w:bottom w:val="single" w:color="CCCCCC" w:sz="1"/>
+              <w:right w:val="single" w:color="CCCCCC" w:sz="1"/>
+            </w:tcBorders>
+            <w:shd w:fill="D5E8F0" w:val="clear"/>
+            <w:tcMar>
+              <w:top w:type="dxa" w:w="80"/>
+              <w:left w:type="dxa" w:w="120"/>
+              <w:bottom w:type="dxa" w:w="80"/>
+              <w:right w:type="dxa" w:w="120"/>
+            </w:tcMar>
+          </w:tcPr>
+          <w:p>
+            <w:pPr>
+              <w:spacing w:after="40"/>
+            </w:pPr>
+            <w:r>
+              <w:rPr>
+                <w:b/>
+                <w:bCs/>
+                <w:color w:val="1F497D"/>
+              </w:rPr>
+              <w:t xml:space="preserve">Tip</w:t>
+            </w:r>
+          </w:p>
+          <w:p>
+            <w:pPr>
+              <w:spacing w:after="0"/>
+            </w:pPr>
+            <w:r>
+              <w:t xml:space="preserve">Run each port-forward in a separate terminal, or in the background with &amp; (Linux/macOS). They remain active until you Ctrl+C or close the terminal.</w:t>
+            </w:r>
+          </w:p>
+        </w:tc>
+      </w:tr>
+    </w:tbl>
+    <w:p>
+      <w:pPr>
+        <w:spacing w:after="80"/>
+      </w:pPr>
+    </w:p>
+    <w:p>
+      <w:pPr>
+        <w:pStyle w:val="Heading2"/>
+      </w:pPr>
+      <w:r>
+        <w:t xml:space="preserve">1.8 Run Regression Tests</w:t>
+      </w:r>
+    </w:p>
+    <w:p>
+      <w:pPr>
+        <w:spacing w:after="120"/>
+      </w:pPr>
+      <w:r>
+        <w:t xml:space="preserve">The regression suite runs as a Kubernetes Job and validates the full platform end-to-end, including RADIUS authentication flows:</w:t>
+      </w:r>
+    </w:p>
+    <w:p>
+      <w:pPr>
+        <w:pBdr>
+          <w:top w:val="single" w:color="CCCCCC" w:sz="2" w:space="1"/>
+          <w:bottom w:val="single" w:color="CCCCCC" w:sz="2" w:space="1"/>
+        </w:pBdr>
+        <w:shd w:fill="F0F0F0" w:val="clear"/>
+        <w:spacing w:after="60" w:before="60"/>
+        <w:ind w:left="360"/>
+      </w:pPr>
+      <w:r>
+        <w:rPr>
+          <w:rFonts w:ascii="Courier New" w:cs="Courier New" w:eastAsia="Courier New" w:hAnsi="Courier New"/>
+          <w:color w:val="1E1E1E"/>
+          <w:sz w:val="18"/>
+          <w:szCs w:val="18"/>
+        </w:rPr>
+        <w:t xml:space="preserve">make test</w:t>
+      </w:r>
+    </w:p>
+    <w:p>
+      <w:pPr>
+        <w:spacing w:after="60"/>
+      </w:pPr>
+    </w:p>
+    <w:p>
+      <w:pPr>
+        <w:spacing w:after="120"/>
+      </w:pPr>
+      <w:r>
+        <w:t xml:space="preserve">To capture RADIUS packet traces during the test run:</w:t>
+      </w:r>
+    </w:p>
+    <w:p>
+      <w:pPr>
+        <w:pBdr>
+          <w:top w:val="single" w:color="CCCCCC" w:sz="2" w:space="1"/>
+          <w:bottom w:val="single" w:color="CCCCCC" w:sz="2" w:space="1"/>
+        </w:pBdr>
+        <w:shd w:fill="F0F0F0" w:val="clear"/>
+        <w:spacing w:after="60" w:before="60"/>
+        <w:ind w:left="360"/>
+      </w:pPr>
+      <w:r>
+        <w:rPr>
+          <w:rFonts w:ascii="Courier New" w:cs="Courier New" w:eastAsia="Courier New" w:hAnsi="Courier New"/>
+          <w:color w:val="1E1E1E"/>
+          <w:sz w:val="18"/>
+          <w:szCs w:val="18"/>
+        </w:rPr>
+        <w:t xml:space="preserve">make test PCAP=true</w:t>
+      </w:r>
+    </w:p>
+    <w:p>
+      <w:pPr>
+        <w:spacing w:after="60"/>
+      </w:pPr>
+    </w:p>
+    <w:p>
+      <w:pPr>
+        <w:spacing w:after="120"/>
+      </w:pPr>
+      <w:r>
+        <w:t xml:space="preserve">Monitor progress with:</w:t>
+      </w:r>
+    </w:p>
+    <w:p>
+      <w:pPr>
+        <w:pBdr>
+          <w:top w:val="single" w:color="CCCCCC" w:sz="2" w:space="1"/>
+          <w:bottom w:val="single" w:color="CCCCCC" w:sz="2" w:space="1"/>
+        </w:pBdr>
+        <w:shd w:fill="F0F0F0" w:val="clear"/>
+        <w:spacing w:after="60" w:before="60"/>
+        <w:ind w:left="360"/>
+      </w:pPr>
+      <w:r>
+        <w:rPr>
+          <w:rFonts w:ascii="Courier New" w:cs="Courier New" w:eastAsia="Courier New" w:hAnsi="Courier New"/>
+          <w:color w:val="1E1E1E"/>
+          <w:sz w:val="18"/>
+          <w:szCs w:val="18"/>
+        </w:rPr>
+        <w:t xml:space="preserve">make status        # shows job pod status</w:t>
+      </w:r>
+    </w:p>
+    <w:p>
+      <w:pPr>
+        <w:pBdr>
+          <w:top w:val="single" w:color="CCCCCC" w:sz="2" w:space="1"/>
+          <w:bottom w:val="single" w:color="CCCCCC" w:sz="2" w:space="1"/>
+        </w:pBdr>
+        <w:shd w:fill="F0F0F0" w:val="clear"/>
+        <w:spacing w:after="60" w:before="60"/>
+        <w:ind w:left="360"/>
+      </w:pPr>
+      <w:r>
+        <w:rPr>
+          <w:rFonts w:ascii="Courier New" w:cs="Courier New" w:eastAsia="Courier New" w:hAnsi="Courier New"/>
+          <w:color w:val="1E1E1E"/>
+          <w:sz w:val="18"/>
+          <w:szCs w:val="18"/>
+        </w:rPr>
+        <w:t xml:space="preserve">make logs          # tails the test runner pod</w:t>
+      </w:r>
+    </w:p>
+    <w:p>
+      <w:pPr>
+        <w:spacing w:after="60"/>
+      </w:pPr>
+    </w:p>
+    <w:tbl>
+      <w:tblPr>
+        <w:tblW w:type="dxa" w:w="9360"/>
+        <w:tblBorders>
+          <w:top w:val="single" w:color="auto" w:sz="4"/>
+          <w:left w:val="single" w:color="auto" w:sz="4"/>
+          <w:bottom w:val="single" w:color="auto" w:sz="4"/>
+          <w:right w:val="single" w:color="auto" w:sz="4"/>
+          <w:insideH w:val="single" w:color="auto" w:sz="4"/>
+          <w:insideV w:val="single" w:color="auto" w:sz="4"/>
+        </w:tblBorders>
+      </w:tblPr>
+      <w:tblGrid>
+        <w:gridCol w:w="9360"/>
+      </w:tblGrid>
+      <w:tr>
+        <w:tc>
+          <w:tcPr>
+            <w:tcW w:type="dxa" w:w="9360"/>
+            <w:tcBorders>
+              <w:top w:val="single" w:color="CCCCCC" w:sz="1"/>
+              <w:left w:val="single" w:color="2E75B6" w:sz="8"/>
+              <w:bottom w:val="single" w:color="CCCCCC" w:sz="1"/>
+              <w:right w:val="single" w:color="CCCCCC" w:sz="1"/>
+            </w:tcBorders>
+            <w:shd w:fill="D5E8F0" w:val="clear"/>
+            <w:tcMar>
+              <w:top w:type="dxa" w:w="80"/>
+              <w:left w:type="dxa" w:w="120"/>
+              <w:bottom w:type="dxa" w:w="80"/>
+              <w:right w:type="dxa" w:w="120"/>
+            </w:tcMar>
+          </w:tcPr>
+          <w:p>
+            <w:pPr>
+              <w:spacing w:after="40"/>
+            </w:pPr>
+            <w:r>
+              <w:rPr>
+                <w:b/>
+                <w:bCs/>
+                <w:color w:val="1F497D"/>
+              </w:rPr>
+              <w:t xml:space="preserve">RADIUS_SECRET must match</w:t>
+            </w:r>
+          </w:p>
+          <w:p>
+            <w:pPr>
+              <w:spacing w:after="0"/>
+            </w:pPr>
+            <w:r>
+              <w:t xml:space="preserve">The regression tests send live RADIUS packets. The RADIUS_SECRET in aaa-regression-tester/.env must match the value used during deploy (defaults to testing123 in dev mode). Set it explicitly in both places for non-default deployments.</w:t>
+            </w:r>
+          </w:p>
+        </w:tc>
+      </w:tr>
+    </w:tbl>
+    <w:p>
+      <w:pPr>
+        <w:spacing w:after="80"/>
+      </w:pPr>
+    </w:p>
+    <w:p>
+      <w:pPr>
+        <w:pStyle w:val="Heading2"/>
+      </w:pPr>
+      <w:r>
+        <w:t xml:space="preserve">1.9 Day-2 Operations</w:t>
+      </w:r>
+    </w:p>
+    <w:tbl>
+      <w:tblPr>
+        <w:tblW w:type="dxa" w:w="9360"/>
+        <w:tblBorders>
+          <w:top w:val="single" w:color="auto" w:sz="4"/>
+          <w:left w:val="single" w:color="auto" w:sz="4"/>
+          <w:bottom w:val="single" w:color="auto" w:sz="4"/>
+          <w:right w:val="single" w:color="auto" w:sz="4"/>
+          <w:insideH w:val="single" w:color="auto" w:sz="4"/>
+          <w:insideV w:val="single" w:color="auto" w:sz="4"/>
+        </w:tblBorders>
+      </w:tblPr>
+      <w:tblGrid>
+        <w:gridCol w:w="3200"/>
+        <w:gridCol w:w="6160"/>
+      </w:tblGrid>
+      <w:tr>
+        <w:trPr>
+          <w:tblHeader/>
+        </w:trPr>
+        <w:tc>
+          <w:tcPr>
+            <w:tcW w:type="dxa" w:w="3200"/>
+            <w:tcBorders>
+              <w:top w:val="single" w:color="CCCCCC" w:sz="1"/>
+              <w:left w:val="single" w:color="CCCCCC" w:sz="1"/>
+              <w:bottom w:val="single" w:color="CCCCCC" w:sz="1"/>
+              <w:right w:val="single" w:color="CCCCCC" w:sz="1"/>
+            </w:tcBorders>
+            <w:shd w:fill="2E75B6" w:val="clear"/>
+            <w:tcMar>
+              <w:top w:type="dxa" w:w="80"/>
+              <w:left w:type="dxa" w:w="120"/>
+              <w:bottom w:type="dxa" w:w="80"/>
+              <w:right w:type="dxa" w:w="120"/>
+            </w:tcMar>
+          </w:tcPr>
+          <w:p>
+            <w:pPr>
+              <w:spacing w:after="0"/>
+            </w:pPr>
+            <w:r>
+              <w:rPr>
+                <w:b/>
+                <w:bCs/>
+                <w:color w:val="FFFFFF"/>
+                <w:sz w:val="18"/>
+                <w:szCs w:val="18"/>
+              </w:rPr>
+              <w:t xml:space="preserve">Command</w:t>
+            </w:r>
+          </w:p>
+        </w:tc>
+        <w:tc>
+          <w:tcPr>
+            <w:tcW w:type="dxa" w:w="6160"/>
+            <w:tcBorders>
+              <w:top w:val="single" w:color="CCCCCC" w:sz="1"/>
+              <w:left w:val="single" w:color="CCCCCC" w:sz="1"/>
+              <w:bottom w:val="single" w:color="CCCCCC" w:sz="1"/>
+              <w:right w:val="single" w:color="CCCCCC" w:sz="1"/>
+            </w:tcBorders>
+            <w:shd w:fill="2E75B6" w:val="clear"/>
+            <w:tcMar>
+              <w:top w:type="dxa" w:w="80"/>
+              <w:left w:type="dxa" w:w="120"/>
+              <w:bottom w:type="dxa" w:w="80"/>
+              <w:right w:type="dxa" w:w="120"/>
+            </w:tcMar>
+          </w:tcPr>
+          <w:p>
+            <w:pPr>
+              <w:spacing w:after="0"/>
+            </w:pPr>
+            <w:r>
+              <w:rPr>
+                <w:b/>
+                <w:bCs/>
+                <w:color w:val="FFFFFF"/>
+                <w:sz w:val="18"/>
+                <w:szCs w:val="18"/>
+              </w:rPr>
+              <w:t xml:space="preserve">Description</w:t>
+            </w:r>
+          </w:p>
+        </w:tc>
+      </w:tr>
+      <w:tr>
+        <w:tc>
+          <w:tcPr>
+            <w:tcW w:type="dxa" w:w="3200"/>
+            <w:tcBorders>
+              <w:top w:val="single" w:color="CCCCCC" w:sz="1"/>
+              <w:left w:val="single" w:color="CCCCCC" w:sz="1"/>
+              <w:bottom w:val="single" w:color="CCCCCC" w:sz="1"/>
+              <w:right w:val="single" w:color="CCCCCC" w:sz="1"/>
+            </w:tcBorders>
+            <w:shd w:fill="FFFFFF" w:val="clear"/>
+            <w:tcMar>
+              <w:top w:type="dxa" w:w="80"/>
+              <w:left w:type="dxa" w:w="120"/>
+              <w:bottom w:type="dxa" w:w="80"/>
+              <w:right w:type="dxa" w:w="120"/>
+            </w:tcMar>
+          </w:tcPr>
+          <w:p>
+            <w:pPr>
+              <w:spacing w:after="0"/>
+            </w:pPr>
+            <w:r>
+              <w:rPr>
+                <w:sz w:val="18"/>
+                <w:szCs w:val="18"/>
+              </w:rPr>
+              <w:t xml:space="preserve">make logs</w:t>
+            </w:r>
+          </w:p>
+        </w:tc>
+        <w:tc>
+          <w:tcPr>
+            <w:tcW w:type="dxa" w:w="6160"/>
+            <w:tcBorders>
+              <w:top w:val="single" w:color="CCCCCC" w:sz="1"/>
+              <w:left w:val="single" w:color="CCCCCC" w:sz="1"/>
+              <w:bottom w:val="single" w:color="CCCCCC" w:sz="1"/>
+              <w:right w:val="single" w:color="CCCCCC" w:sz="1"/>
+            </w:tcBorders>
+            <w:shd w:fill="FFFFFF" w:val="clear"/>
+            <w:tcMar>
+              <w:top w:type="dxa" w:w="80"/>
+              <w:left w:type="dxa" w:w="120"/>
+              <w:bottom w:type="dxa" w:w="80"/>
+              <w:right w:type="dxa" w:w="120"/>
+            </w:tcMar>
+          </w:tcPr>
+          <w:p>
+            <w:pPr>
+              <w:spacing w:after="0"/>
+            </w:pPr>
+            <w:r>
+              <w:rPr>
+                <w:sz w:val="18"/>
+                <w:szCs w:val="18"/>
+              </w:rPr>
+              <w:t xml:space="preserve">Tail logs from all platform pods (combined stream)</w:t>
+            </w:r>
+          </w:p>
+        </w:tc>
+      </w:tr>
+      <w:tr>
+        <w:tc>
+          <w:tcPr>
+            <w:tcW w:type="dxa" w:w="3200"/>
+            <w:tcBorders>
+              <w:top w:val="single" w:color="CCCCCC" w:sz="1"/>
+              <w:left w:val="single" w:color="CCCCCC" w:sz="1"/>
+              <w:bottom w:val="single" w:color="CCCCCC" w:sz="1"/>
+              <w:right w:val="single" w:color="CCCCCC" w:sz="1"/>
+            </w:tcBorders>
+            <w:shd w:fill="F2F2F2" w:val="clear"/>
+            <w:tcMar>
+              <w:top w:type="dxa" w:w="80"/>
+              <w:left w:type="dxa" w:w="120"/>
+              <w:bottom w:type="dxa" w:w="80"/>
+              <w:right w:type="dxa" w:w="120"/>
+            </w:tcMar>
+          </w:tcPr>
+          <w:p>
+            <w:pPr>
+              <w:spacing w:after="0"/>
+            </w:pPr>
+            <w:r>
+              <w:rPr>
+                <w:sz w:val="18"/>
+                <w:szCs w:val="18"/>
+              </w:rPr>
+              <w:t xml:space="preserve">make logs-api</w:t>
+            </w:r>
+          </w:p>
+        </w:tc>
+        <w:tc>
+          <w:tcPr>
+            <w:tcW w:type="dxa" w:w="6160"/>
+            <w:tcBorders>
+              <w:top w:val="single" w:color="CCCCCC" w:sz="1"/>
+              <w:left w:val="single" w:color="CCCCCC" w:sz="1"/>
+              <w:bottom w:val="single" w:color="CCCCCC" w:sz="1"/>
+              <w:right w:val="single" w:color="CCCCCC" w:sz="1"/>
+            </w:tcBorders>
+            <w:shd w:fill="F2F2F2" w:val="clear"/>
+            <w:tcMar>
+              <w:top w:type="dxa" w:w="80"/>
+              <w:left w:type="dxa" w:w="120"/>
+              <w:bottom w:type="dxa" w:w="80"/>
+              <w:right w:type="dxa" w:w="120"/>
+            </w:tcMar>
+          </w:tcPr>
+          <w:p>
+            <w:pPr>
+              <w:spacing w:after="0"/>
+            </w:pPr>
+            <w:r>
+              <w:rPr>
+                <w:sz w:val="18"/>
+                <w:szCs w:val="18"/>
+              </w:rPr>
+              <w:t xml:space="preserve">Tail subscriber-profile-api logs only</w:t>
+            </w:r>
+          </w:p>
+        </w:tc>
+      </w:tr>
+      <w:tr>
+        <w:tc>
+          <w:tcPr>
+            <w:tcW w:type="dxa" w:w="3200"/>
+            <w:tcBorders>
+              <w:top w:val="single" w:color="CCCCCC" w:sz="1"/>
+              <w:left w:val="single" w:color="CCCCCC" w:sz="1"/>
+              <w:bottom w:val="single" w:color="CCCCCC" w:sz="1"/>
+              <w:right w:val="single" w:color="CCCCCC" w:sz="1"/>
+            </w:tcBorders>
+            <w:shd w:fill="FFFFFF" w:val="clear"/>
+            <w:tcMar>
+              <w:top w:type="dxa" w:w="80"/>
+              <w:left w:type="dxa" w:w="120"/>
+              <w:bottom w:type="dxa" w:w="80"/>
+              <w:right w:type="dxa" w:w="120"/>
+            </w:tcMar>
+          </w:tcPr>
+          <w:p>
+            <w:pPr>
+              <w:spacing w:after="0"/>
+            </w:pPr>
+            <w:r>
+              <w:rPr>
+                <w:sz w:val="18"/>
+                <w:szCs w:val="18"/>
+              </w:rPr>
+              <w:t xml:space="preserve">make logs-lookup</w:t>
+            </w:r>
+          </w:p>
+        </w:tc>
+        <w:tc>
+          <w:tcPr>
+            <w:tcW w:type="dxa" w:w="6160"/>
+            <w:tcBorders>
+              <w:top w:val="single" w:color="CCCCCC" w:sz="1"/>
+              <w:left w:val="single" w:color="CCCCCC" w:sz="1"/>
+              <w:bottom w:val="single" w:color="CCCCCC" w:sz="1"/>
+              <w:right w:val="single" w:color="CCCCCC" w:sz="1"/>
+            </w:tcBorders>
+            <w:shd w:fill="FFFFFF" w:val="clear"/>
+            <w:tcMar>
+              <w:top w:type="dxa" w:w="80"/>
+              <w:left w:type="dxa" w:w="120"/>
+              <w:bottom w:type="dxa" w:w="80"/>
+              <w:right w:type="dxa" w:w="120"/>
+            </w:tcMar>
+          </w:tcPr>
+          <w:p>
+            <w:pPr>
+              <w:spacing w:after="0"/>
+            </w:pPr>
+            <w:r>
+              <w:rPr>
+                <w:sz w:val="18"/>
+                <w:szCs w:val="18"/>
+              </w:rPr>
+              <w:t xml:space="preserve">Tail aaa-lookup-service logs only</w:t>
+            </w:r>
+          </w:p>
+        </w:tc>
+      </w:tr>
+      <w:tr>
+        <w:tc>
+          <w:tcPr>
+            <w:tcW w:type="dxa" w:w="3200"/>
+            <w:tcBorders>
+              <w:top w:val="single" w:color="CCCCCC" w:sz="1"/>
+              <w:left w:val="single" w:color="CCCCCC" w:sz="1"/>
+              <w:bottom w:val="single" w:color="CCCCCC" w:sz="1"/>
+              <w:right w:val="single" w:color="CCCCCC" w:sz="1"/>
+            </w:tcBorders>
+            <w:shd w:fill="F2F2F2" w:val="clear"/>
+            <w:tcMar>
+              <w:top w:type="dxa" w:w="80"/>
+              <w:left w:type="dxa" w:w="120"/>
+              <w:bottom w:type="dxa" w:w="80"/>
+              <w:right w:type="dxa" w:w="120"/>
+            </w:tcMar>
+          </w:tcPr>
+          <w:p>
+            <w:pPr>
+              <w:spacing w:after="0"/>
+            </w:pPr>
+            <w:r>
+              <w:rPr>
+                <w:sz w:val="18"/>
+                <w:szCs w:val="18"/>
+              </w:rPr>
+              <w:t xml:space="preserve">make logs-ui</w:t>
+            </w:r>
+          </w:p>
+        </w:tc>
+        <w:tc>
+          <w:tcPr>
+            <w:tcW w:type="dxa" w:w="6160"/>
+            <w:tcBorders>
+              <w:top w:val="single" w:color="CCCCCC" w:sz="1"/>
+              <w:left w:val="single" w:color="CCCCCC" w:sz="1"/>
+              <w:bottom w:val="single" w:color="CCCCCC" w:sz="1"/>
+              <w:right w:val="single" w:color="CCCCCC" w:sz="1"/>
+            </w:tcBorders>
+            <w:shd w:fill="F2F2F2" w:val="clear"/>
+            <w:tcMar>
+              <w:top w:type="dxa" w:w="80"/>
+              <w:left w:type="dxa" w:w="120"/>
+              <w:bottom w:type="dxa" w:w="80"/>
+              <w:right w:type="dxa" w:w="120"/>
+            </w:tcMar>
+          </w:tcPr>
+          <w:p>
+            <w:pPr>
+              <w:spacing w:after="0"/>
+            </w:pPr>
+            <w:r>
+              <w:rPr>
+                <w:sz w:val="18"/>
+                <w:szCs w:val="18"/>
+              </w:rPr>
+              <w:t xml:space="preserve">Tail aaa-management-ui logs only</w:t>
+            </w:r>
+          </w:p>
+        </w:tc>
+      </w:tr>
+      <w:tr>
+        <w:tc>
+          <w:tcPr>
+            <w:tcW w:type="dxa" w:w="3200"/>
+            <w:tcBorders>
+              <w:top w:val="single" w:color="CCCCCC" w:sz="1"/>
+              <w:left w:val="single" w:color="CCCCCC" w:sz="1"/>
+              <w:bottom w:val="single" w:color="CCCCCC" w:sz="1"/>
+              <w:right w:val="single" w:color="CCCCCC" w:sz="1"/>
+            </w:tcBorders>
+            <w:shd w:fill="FFFFFF" w:val="clear"/>
+            <w:tcMar>
+              <w:top w:type="dxa" w:w="80"/>
+              <w:left w:type="dxa" w:w="120"/>
+              <w:bottom w:type="dxa" w:w="80"/>
+              <w:right w:type="dxa" w:w="120"/>
+            </w:tcMar>
+          </w:tcPr>
+          <w:p>
+            <w:pPr>
+              <w:spacing w:after="0"/>
+            </w:pPr>
+            <w:r>
+              <w:rPr>
+                <w:sz w:val="18"/>
+                <w:szCs w:val="18"/>
+              </w:rPr>
+              <w:t xml:space="preserve">make db-flush-stale</w:t>
+            </w:r>
+          </w:p>
+        </w:tc>
+        <w:tc>
+          <w:tcPr>
+            <w:tcW w:type="dxa" w:w="6160"/>
+            <w:tcBorders>
+              <w:top w:val="single" w:color="CCCCCC" w:sz="1"/>
+              <w:left w:val="single" w:color="CCCCCC" w:sz="1"/>
+              <w:bottom w:val="single" w:color="CCCCCC" w:sz="1"/>
+              <w:right w:val="single" w:color="CCCCCC" w:sz="1"/>
+            </w:tcBorders>
+            <w:shd w:fill="FFFFFF" w:val="clear"/>
+            <w:tcMar>
+              <w:top w:type="dxa" w:w="80"/>
+              <w:left w:type="dxa" w:w="120"/>
+              <w:bottom w:type="dxa" w:w="80"/>
+              <w:right w:type="dxa" w:w="120"/>
+            </w:tcMar>
+          </w:tcPr>
+          <w:p>
+            <w:pPr>
+              <w:spacing w:after="0"/>
+            </w:pPr>
+            <w:r>
+              <w:rPr>
+                <w:sz w:val="18"/>
+                <w:szCs w:val="18"/>
+              </w:rPr>
+              <w:t xml:space="preserve">Truncate sim_profiles, imsi2sim, imsi_apn_ips, sim_apn_ips (dev only — non-reversible)</w:t>
+            </w:r>
+          </w:p>
+        </w:tc>
+      </w:tr>
+      <w:tr>
+        <w:tc>
+          <w:tcPr>
+            <w:tcW w:type="dxa" w:w="3200"/>
+            <w:tcBorders>
+              <w:top w:val="single" w:color="CCCCCC" w:sz="1"/>
+              <w:left w:val="single" w:color="CCCCCC" w:sz="1"/>
+              <w:bottom w:val="single" w:color="CCCCCC" w:sz="1"/>
+              <w:right w:val="single" w:color="CCCCCC" w:sz="1"/>
+            </w:tcBorders>
+            <w:shd w:fill="F2F2F2" w:val="clear"/>
+            <w:tcMar>
+              <w:top w:type="dxa" w:w="80"/>
+              <w:left w:type="dxa" w:w="120"/>
+              <w:bottom w:type="dxa" w:w="80"/>
+              <w:right w:type="dxa" w:w="120"/>
+            </w:tcMar>
+          </w:tcPr>
+          <w:p>
+            <w:pPr>
+              <w:spacing w:after="0"/>
+            </w:pPr>
+            <w:r>
+              <w:rPr>
+                <w:sz w:val="18"/>
+                <w:szCs w:val="18"/>
+              </w:rPr>
+              <w:t xml:space="preserve">make helm-unlock</w:t>
+            </w:r>
+          </w:p>
+        </w:tc>
+        <w:tc>
+          <w:tcPr>
+            <w:tcW w:type="dxa" w:w="6160"/>
+            <w:tcBorders>
+              <w:top w:val="single" w:color="CCCCCC" w:sz="1"/>
+              <w:left w:val="single" w:color="CCCCCC" w:sz="1"/>
+              <w:bottom w:val="single" w:color="CCCCCC" w:sz="1"/>
+              <w:right w:val="single" w:color="CCCCCC" w:sz="1"/>
+            </w:tcBorders>
+            <w:shd w:fill="F2F2F2" w:val="clear"/>
+            <w:tcMar>
+              <w:top w:type="dxa" w:w="80"/>
+              <w:left w:type="dxa" w:w="120"/>
+              <w:bottom w:type="dxa" w:w="80"/>
+              <w:right w:type="dxa" w:w="120"/>
+            </w:tcMar>
+          </w:tcPr>
+          <w:p>
+            <w:pPr>
+              <w:spacing w:after="0"/>
+            </w:pPr>
+            <w:r>
+              <w:rPr>
+                <w:sz w:val="18"/>
+                <w:szCs w:val="18"/>
+              </w:rPr>
+              <w:t xml:space="preserve">Clear a stuck Helm release lock (failed upgrade left pending state)</w:t>
+            </w:r>
+          </w:p>
+        </w:tc>
+      </w:tr>
+      <w:tr>
+        <w:tc>
+          <w:tcPr>
+            <w:tcW w:type="dxa" w:w="3200"/>
+            <w:tcBorders>
+              <w:top w:val="single" w:color="CCCCCC" w:sz="1"/>
+              <w:left w:val="single" w:color="CCCCCC" w:sz="1"/>
+              <w:bottom w:val="single" w:color="CCCCCC" w:sz="1"/>
+              <w:right w:val="single" w:color="CCCCCC" w:sz="1"/>
+            </w:tcBorders>
+            <w:shd w:fill="FFFFFF" w:val="clear"/>
+            <w:tcMar>
+              <w:top w:type="dxa" w:w="80"/>
+              <w:left w:type="dxa" w:w="120"/>
+              <w:bottom w:type="dxa" w:w="80"/>
+              <w:right w:type="dxa" w:w="120"/>
+            </w:tcMar>
+          </w:tcPr>
+          <w:p>
+            <w:pPr>
+              <w:spacing w:after="0"/>
+            </w:pPr>
+            <w:r>
+              <w:rPr>
+                <w:sz w:val="18"/>
+                <w:szCs w:val="18"/>
+              </w:rPr>
+              <w:t xml:space="preserve">make uninstall</w:t>
+            </w:r>
+          </w:p>
+        </w:tc>
+        <w:tc>
+          <w:tcPr>
+            <w:tcW w:type="dxa" w:w="6160"/>
+            <w:tcBorders>
+              <w:top w:val="single" w:color="CCCCCC" w:sz="1"/>
+              <w:left w:val="single" w:color="CCCCCC" w:sz="1"/>
+              <w:bottom w:val="single" w:color="CCCCCC" w:sz="1"/>
+              <w:right w:val="single" w:color="CCCCCC" w:sz="1"/>
+            </w:tcBorders>
+            <w:shd w:fill="FFFFFF" w:val="clear"/>
+            <w:tcMar>
+              <w:top w:type="dxa" w:w="80"/>
+              <w:left w:type="dxa" w:w="120"/>
+              <w:bottom w:type="dxa" w:w="80"/>
+              <w:right w:type="dxa" w:w="120"/>
+            </w:tcMar>
+          </w:tcPr>
+          <w:p>
+            <w:pPr>
+              <w:spacing w:after="0"/>
+            </w:pPr>
+            <w:r>
+              <w:rPr>
+                <w:sz w:val="18"/>
+                <w:szCs w:val="18"/>
+              </w:rPr>
+              <w:t xml:space="preserve">Remove all Helm releases, the CNPG cluster, and PVCs</w:t>
+            </w:r>
+          </w:p>
+        </w:tc>
+      </w:tr>
+      <w:tr>
+        <w:tc>
+          <w:tcPr>
+            <w:tcW w:type="dxa" w:w="3200"/>
+            <w:tcBorders>
+              <w:top w:val="single" w:color="CCCCCC" w:sz="1"/>
+              <w:left w:val="single" w:color="CCCCCC" w:sz="1"/>
+              <w:bottom w:val="single" w:color="CCCCCC" w:sz="1"/>
+              <w:right w:val="single" w:color="CCCCCC" w:sz="1"/>
+            </w:tcBorders>
+            <w:shd w:fill="F2F2F2" w:val="clear"/>
+            <w:tcMar>
+              <w:top w:type="dxa" w:w="80"/>
+              <w:left w:type="dxa" w:w="120"/>
+              <w:bottom w:type="dxa" w:w="80"/>
+              <w:right w:type="dxa" w:w="120"/>
+            </w:tcMar>
+          </w:tcPr>
+          <w:p>
+            <w:pPr>
+              <w:spacing w:after="0"/>
+            </w:pPr>
+            <w:r>
+              <w:rPr>
+                <w:sz w:val="18"/>
+                <w:szCs w:val="18"/>
+              </w:rPr>
+              <w:t xml:space="preserve">make clean</w:t>
+            </w:r>
+          </w:p>
+        </w:tc>
+        <w:tc>
+          <w:tcPr>
+            <w:tcW w:type="dxa" w:w="6160"/>
+            <w:tcBorders>
+              <w:top w:val="single" w:color="CCCCCC" w:sz="1"/>
+              <w:left w:val="single" w:color="CCCCCC" w:sz="1"/>
+              <w:bottom w:val="single" w:color="CCCCCC" w:sz="1"/>
+              <w:right w:val="single" w:color="CCCCCC" w:sz="1"/>
+            </w:tcBorders>
+            <w:shd w:fill="F2F2F2" w:val="clear"/>
+            <w:tcMar>
+              <w:top w:type="dxa" w:w="80"/>
+              <w:left w:type="dxa" w:w="120"/>
+              <w:bottom w:type="dxa" w:w="80"/>
+              <w:right w:type="dxa" w:w="120"/>
+            </w:tcMar>
+          </w:tcPr>
+          <w:p>
+            <w:pPr>
+              <w:spacing w:after="0"/>
+            </w:pPr>
+            <w:r>
+              <w:rPr>
+                <w:sz w:val="18"/>
+                <w:szCs w:val="18"/>
+              </w:rPr>
+              <w:t xml:space="preserve">Full teardown: uninstall everything + destroy the k3d cluster</w:t>
+            </w:r>
+          </w:p>
+        </w:tc>
+      </w:tr>
+    </w:tbl>
+    <w:p>
+      <w:pPr>
+        <w:spacing w:after="60"/>
+      </w:pPr>
+    </w:p>
+    <w:tbl>
+      <w:tblPr>
+        <w:tblW w:type="dxa" w:w="9360"/>
+        <w:tblBorders>
+          <w:top w:val="single" w:color="auto" w:sz="4"/>
+          <w:left w:val="single" w:color="auto" w:sz="4"/>
+          <w:bottom w:val="single" w:color="auto" w:sz="4"/>
+          <w:right w:val="single" w:color="auto" w:sz="4"/>
+          <w:insideH w:val="single" w:color="auto" w:sz="4"/>
+          <w:insideV w:val="single" w:color="auto" w:sz="4"/>
+        </w:tblBorders>
+      </w:tblPr>
+      <w:tblGrid>
+        <w:gridCol w:w="9360"/>
+      </w:tblGrid>
+      <w:tr>
+        <w:tc>
+          <w:tcPr>
+            <w:tcW w:type="dxa" w:w="9360"/>
+            <w:tcBorders>
+              <w:top w:val="single" w:color="CCCCCC" w:sz="1"/>
+              <w:left w:val="single" w:color="2E75B6" w:sz="8"/>
+              <w:bottom w:val="single" w:color="CCCCCC" w:sz="1"/>
+              <w:right w:val="single" w:color="CCCCCC" w:sz="1"/>
+            </w:tcBorders>
+            <w:shd w:fill="FCE4D6" w:val="clear"/>
+            <w:tcMar>
+              <w:top w:type="dxa" w:w="80"/>
+              <w:left w:type="dxa" w:w="120"/>
+              <w:bottom w:type="dxa" w:w="80"/>
+              <w:right w:type="dxa" w:w="120"/>
+            </w:tcMar>
+          </w:tcPr>
+          <w:p>
+            <w:pPr>
+              <w:spacing w:after="40"/>
+            </w:pPr>
+            <w:r>
+              <w:rPr>
+                <w:b/>
+                <w:bCs/>
+                <w:color w:val="1F497D"/>
+              </w:rPr>
+              <w:t xml:space="preserve">Warning</w:t>
+            </w:r>
+          </w:p>
+          <w:p>
+            <w:pPr>
+              <w:spacing w:after="0"/>
+            </w:pPr>
+            <w:r>
+              <w:t xml:space="preserve">make db-flush-stale truncates subscriber and IP assignment tables without confirmation. Use only in development environments. make uninstall deletes PVCs — all database data will be lost.</w:t>
+            </w:r>
+          </w:p>
+        </w:tc>
+      </w:tr>
+    </w:tbl>
+    <w:p>
+      <w:pPr>
+        <w:spacing w:after="80"/>
+      </w:pPr>
+    </w:p>
+    <w:p>
+      <w:pPr>
+        <w:pStyle w:val="Heading1"/>
+      </w:pPr>
+      <w:r>
+        <w:t xml:space="preserve">2. Getting Started</w:t>
+      </w:r>
+    </w:p>
+    <w:p>
+      <w:pPr>
+        <w:spacing w:after="120"/>
+      </w:pPr>
+      <w:r>
+        <w:t xml:space="preserve">This guide covers day-to-day operations for provisioning subscribers, managing IP address pools, and monitoring the AAA Cloud-Native Platform. It is intended for telecom network engineers and operations teams. For first-time deployment instructions see Section 1.</w:t>
       </w:r>
     </w:p>
     <w:p>
@@ -214,7 +4397,7 @@
         <w:pStyle w:val="Heading2"/>
       </w:pPr>
       <w:r>
-        <w:t xml:space="preserve">1.1 Prerequisites</w:t>
+        <w:t xml:space="preserve">2.1 Prerequisites</w:t>
       </w:r>
     </w:p>
     <w:p>
@@ -292,7 +4475,7 @@
         <w:pStyle w:val="Heading2"/>
       </w:pPr>
       <w:r>
-        <w:t xml:space="preserve">1.2 API Access</w:t>
+        <w:t xml:space="preserve">2.2 API Access</w:t>
       </w:r>
     </w:p>
     <w:p>
@@ -570,7 +4753,7 @@
         <w:pStyle w:val="Heading2"/>
       </w:pPr>
       <w:r>
-        <w:t xml:space="preserve">1.3 Health Check</w:t>
+        <w:t xml:space="preserve">2.3 Health Check</w:t>
       </w:r>
     </w:p>
     <w:p>
@@ -676,7 +4859,7 @@
         <w:pStyle w:val="Heading1"/>
       </w:pPr>
       <w:r>
-        <w:t xml:space="preserve">2. IP Pool Management</w:t>
+        <w:t xml:space="preserve">3. IP Pool Management</w:t>
       </w:r>
     </w:p>
     <w:p>
@@ -697,7 +4880,7 @@
         <w:pStyle w:val="Heading2"/>
       </w:pPr>
       <w:r>
-        <w:t xml:space="preserve">2.1 Create an IP Pool</w:t>
+        <w:t xml:space="preserve">3.1 Create an IP Pool</w:t>
       </w:r>
     </w:p>
     <w:p>
@@ -1231,7 +5414,7 @@
         <w:pStyle w:val="Heading2"/>
       </w:pPr>
       <w:r>
-        <w:t xml:space="preserve">2.2 Check Pool Statistics</w:t>
+        <w:t xml:space="preserve">3.2 Check Pool Statistics</w:t>
       </w:r>
     </w:p>
     <w:p>
@@ -1424,7 +5607,7 @@
         <w:pStyle w:val="Heading2"/>
       </w:pPr>
       <w:r>
-        <w:t xml:space="preserve">2.3 Suspend and Reactivate a Pool</w:t>
+        <w:t xml:space="preserve">3.3 Suspend and Reactivate a Pool</w:t>
       </w:r>
     </w:p>
     <w:p>
@@ -1547,7 +5730,7 @@
         <w:pStyle w:val="Heading1"/>
       </w:pPr>
       <w:r>
-        <w:t xml:space="preserve">3. Range Configurations</w:t>
+        <w:t xml:space="preserve">4. Range Configurations</w:t>
       </w:r>
     </w:p>
     <w:p>
@@ -1568,7 +5751,7 @@
         <w:pStyle w:val="Heading2"/>
       </w:pPr>
       <w:r>
-        <w:t xml:space="preserve">3.1 Single-IMSI Range Config</w:t>
+        <w:t xml:space="preserve">4.1 Single-IMSI Range Config</w:t>
       </w:r>
     </w:p>
     <w:p>
@@ -2135,7 +6318,7 @@
         <w:pStyle w:val="Heading2"/>
       </w:pPr>
       <w:r>
-        <w:t xml:space="preserve">3.2 Multi-IMSI SIM Range Config</w:t>
+        <w:t xml:space="preserve">4.2 Multi-IMSI SIM Range Config</w:t>
       </w:r>
     </w:p>
     <w:p>
@@ -2847,7 +7030,7 @@
         <w:pStyle w:val="Heading2"/>
       </w:pPr>
       <w:r>
-        <w:t xml:space="preserve">3.3 Per-APN Pool Overrides</w:t>
+        <w:t xml:space="preserve">4.3 Per-APN Pool Overrides</w:t>
       </w:r>
     </w:p>
     <w:p>
@@ -3274,7 +7457,7 @@
         <w:pStyle w:val="Heading2"/>
       </w:pPr>
       <w:r>
-        <w:t xml:space="preserve">3.4 Auto-Allocation Scenarios</w:t>
+        <w:t xml:space="preserve">4.4 Auto-Allocation Scenarios</w:t>
       </w:r>
     </w:p>
     <w:p>
@@ -7204,7 +11387,7 @@
         <w:pStyle w:val="Heading1"/>
       </w:pPr>
       <w:r>
-        <w:t xml:space="preserve">4. Subscriber Provisioning</w:t>
+        <w:t xml:space="preserve">5. Subscriber Provisioning</w:t>
       </w:r>
     </w:p>
     <w:p>
@@ -7225,7 +11408,7 @@
         <w:pStyle w:val="Heading2"/>
       </w:pPr>
       <w:r>
-        <w:t xml:space="preserve">4.1 Create a Profile (Profile Mode B - IMSI-level IP)</w:t>
+        <w:t xml:space="preserve">5.1 Create a Profile (Profile Mode B - IMSI-level IP)</w:t>
       </w:r>
     </w:p>
     <w:p>
@@ -7551,7 +11734,7 @@
         <w:pStyle w:val="Heading2"/>
       </w:pPr>
       <w:r>
-        <w:t xml:space="preserve">4.2 Create a Profile (Profile Mode C - APN-specific IP)</w:t>
+        <w:t xml:space="preserve">5.2 Create a Profile (Profile Mode C - APN-specific IP)</w:t>
       </w:r>
     </w:p>
     <w:p>
@@ -7877,7 +12060,7 @@
         <w:pStyle w:val="Heading2"/>
       </w:pPr>
       <w:r>
-        <w:t xml:space="preserve">4.3 Create a Profile (Profile Mode A - Card-level IP)</w:t>
+        <w:t xml:space="preserve">5.3 Create a Profile (Profile Mode A - Card-level IP)</w:t>
       </w:r>
     </w:p>
     <w:p>
@@ -8143,7 +12326,7 @@
         <w:pStyle w:val="Heading2"/>
       </w:pPr>
       <w:r>
-        <w:t xml:space="preserve">4.4 Look Up an Existing Profile</w:t>
+        <w:t xml:space="preserve">5.4 Look Up an Existing Profile</w:t>
       </w:r>
     </w:p>
     <w:p>
@@ -8376,7 +12559,7 @@
         <w:pStyle w:val="Heading2"/>
       </w:pPr>
       <w:r>
-        <w:t xml:space="preserve">4.5 Update a Profile</w:t>
+        <w:t xml:space="preserve">5.5 Update a Profile</w:t>
       </w:r>
     </w:p>
     <w:p>
@@ -8537,7 +12720,7 @@
         <w:pStyle w:val="Heading1"/>
       </w:pPr>
       <w:r>
-        <w:t xml:space="preserve">5. Subscriber Lifecycle Management</w:t>
+        <w:t xml:space="preserve">6. Subscriber Lifecycle Management</w:t>
       </w:r>
     </w:p>
     <w:p>
@@ -8545,7 +12728,7 @@
         <w:pStyle w:val="Heading2"/>
       </w:pPr>
       <w:r>
-        <w:t xml:space="preserve">5.1 Suspend a Subscriber</w:t>
+        <w:t xml:space="preserve">6.1 Suspend a Subscriber</w:t>
       </w:r>
     </w:p>
     <w:p>
@@ -8668,7 +12851,7 @@
         <w:pStyle w:val="Heading2"/>
       </w:pPr>
       <w:r>
-        <w:t xml:space="preserve">5.2 Reactivate a Subscriber</w:t>
+        <w:t xml:space="preserve">6.2 Reactivate a Subscriber</w:t>
       </w:r>
     </w:p>
     <w:p>
@@ -8721,7 +12904,7 @@
         <w:pStyle w:val="Heading2"/>
       </w:pPr>
       <w:r>
-        <w:t xml:space="preserve">5.3 Terminate a Subscriber</w:t>
+        <w:t xml:space="preserve">6.3 Terminate a Subscriber</w:t>
       </w:r>
     </w:p>
     <w:p>
@@ -8844,7 +13027,7 @@
         <w:pStyle w:val="Heading2"/>
       </w:pPr>
       <w:r>
-        <w:t xml:space="preserve">5.4 Manage IMSIs on a Profile</w:t>
+        <w:t xml:space="preserve">6.4 Manage IMSIs on a Profile</w:t>
       </w:r>
     </w:p>
     <w:p>
@@ -9177,7 +13360,7 @@
         <w:pStyle w:val="Heading1"/>
       </w:pPr>
       <w:r>
-        <w:t xml:space="preserve">6. Bulk Provisioning</w:t>
+        <w:t xml:space="preserve">7. Bulk Provisioning</w:t>
       </w:r>
     </w:p>
     <w:p>
@@ -9198,7 +13381,7 @@
         <w:pStyle w:val="Heading2"/>
       </w:pPr>
       <w:r>
-        <w:t xml:space="preserve">6.1 JSON Bulk Upload</w:t>
+        <w:t xml:space="preserve">7.1 JSON Bulk Upload</w:t>
       </w:r>
     </w:p>
     <w:p>
@@ -9471,7 +13654,7 @@
         <w:pStyle w:val="Heading2"/>
       </w:pPr>
       <w:r>
-        <w:t xml:space="preserve">6.2 CSV Bulk Upload</w:t>
+        <w:t xml:space="preserve">7.2 CSV Bulk Upload</w:t>
       </w:r>
     </w:p>
     <w:p>
@@ -9552,7 +13735,7 @@
         <w:pStyle w:val="Heading2"/>
       </w:pPr>
       <w:r>
-        <w:t xml:space="preserve">6.3 Monitor a Bulk Job</w:t>
+        <w:t xml:space="preserve">7.3 Monitor a Bulk Job</w:t>
       </w:r>
     </w:p>
     <w:p>
@@ -9947,7 +14130,7 @@
         <w:pStyle w:val="Heading2"/>
       </w:pPr>
       <w:r>
-        <w:t xml:space="preserve">6.4 Profile Structure by Scenario</w:t>
+        <w:t xml:space="preserve">7.4 Profile Structure by Scenario</w:t>
       </w:r>
     </w:p>
     <w:p>
@@ -12596,7 +16779,7 @@
         <w:pStyle w:val="Heading1"/>
       </w:pPr>
       <w:r>
-        <w:t xml:space="preserve">7. Monitoring First-Connection Allocation</w:t>
+        <w:t xml:space="preserve">8. Monitoring First-Connection Allocation</w:t>
       </w:r>
     </w:p>
     <w:p>
@@ -12617,7 +16800,7 @@
         <w:pStyle w:val="Heading2"/>
       </w:pPr>
       <w:r>
-        <w:t xml:space="preserve">7.1 What Happens at First Connection</w:t>
+        <w:t xml:space="preserve">8.1 What Happens at First Connection</w:t>
       </w:r>
     </w:p>
     <w:p>
@@ -12760,7 +16943,7 @@
         <w:pStyle w:val="Heading2"/>
       </w:pPr>
       <w:r>
-        <w:t xml:space="preserve">7.2 Key Metrics to Watch</w:t>
+        <w:t xml:space="preserve">8.2 Key Metrics to Watch</w:t>
       </w:r>
     </w:p>
     <w:tbl>
@@ -13263,7 +17446,7 @@
         <w:pStyle w:val="Heading2"/>
       </w:pPr>
       <w:r>
-        <w:t xml:space="preserve">7.3 Verify a Provisioned Subscriber After First Connection</w:t>
+        <w:t xml:space="preserve">8.3 Verify a Provisioned Subscriber After First Connection</w:t>
       </w:r>
     </w:p>
     <w:p>
@@ -13436,7 +17619,7 @@
         <w:pStyle w:val="Heading2"/>
       </w:pPr>
       <w:r>
-        <w:t xml:space="preserve">7.4 aaa-radius-server Integration Points</w:t>
+        <w:t xml:space="preserve">8.4 aaa-radius-server Integration Points</w:t>
       </w:r>
     </w:p>
     <w:p>
@@ -13942,7 +18125,7 @@
         <w:pStyle w:val="Heading1"/>
       </w:pPr>
       <w:r>
-        <w:t xml:space="preserve">8. Common Operational Tasks</w:t>
+        <w:t xml:space="preserve">9. Common Operational Tasks</w:t>
       </w:r>
     </w:p>
     <w:p>
@@ -13950,7 +18133,7 @@
         <w:pStyle w:val="Heading2"/>
       </w:pPr>
       <w:r>
-        <w:t xml:space="preserve">8.1 List All Pools for an Account</w:t>
+        <w:t xml:space="preserve">9.1 List All Pools for an Account</w:t>
       </w:r>
     </w:p>
     <w:p>
@@ -13978,7 +18161,7 @@
         <w:pStyle w:val="Heading2"/>
       </w:pPr>
       <w:r>
-        <w:t xml:space="preserve">8.2 Find a Profile by ICCID</w:t>
+        <w:t xml:space="preserve">9.2 Find a Profile by ICCID</w:t>
       </w:r>
     </w:p>
     <w:p>
@@ -14011,7 +18194,7 @@
         <w:pStyle w:val="Heading2"/>
       </w:pPr>
       <w:r>
-        <w:t xml:space="preserve">8.3 Update a Range Config Pool</w:t>
+        <w:t xml:space="preserve">9.3 Update a Range Config Pool</w:t>
       </w:r>
     </w:p>
     <w:p>
@@ -14134,7 +18317,7 @@
         <w:pStyle w:val="Heading2"/>
       </w:pPr>
       <w:r>
-        <w:t xml:space="preserve">8.4 Expand IP Capacity for a Subscriber Segment</w:t>
+        <w:t xml:space="preserve">9.4 Expand IP Capacity for a Subscriber Segment</w:t>
       </w:r>
     </w:p>
     <w:p>
@@ -14199,7 +18382,7 @@
         <w:pStyle w:val="Heading2"/>
       </w:pPr>
       <w:r>
-        <w:t xml:space="preserve">8.5 Perform a Migration Import</w:t>
+        <w:t xml:space="preserve">9.5 Perform a Migration Import</w:t>
       </w:r>
     </w:p>
     <w:p>
@@ -14290,7 +18473,7 @@
         <w:pStyle w:val="Heading1"/>
       </w:pPr>
       <w:r>
-        <w:t xml:space="preserve">9. Error Reference</w:t>
+        <w:t xml:space="preserve">10. Error Reference</w:t>
       </w:r>
     </w:p>
     <w:p>
@@ -15010,7 +19193,7 @@
         <w:pStyle w:val="Heading2"/>
       </w:pPr>
       <w:r>
-        <w:t xml:space="preserve">9.1 Common Validation Rules</w:t>
+        <w:t xml:space="preserve">10.1 Common Validation Rules</w:t>
       </w:r>
     </w:p>
     <w:tbl>
@@ -15483,7 +19666,7 @@
         <w:pStyle w:val="Heading1"/>
       </w:pPr>
       <w:r>
-        <w:t xml:space="preserve">10. Local Development Setup</w:t>
+        <w:t xml:space="preserve">11. Local Development Setup</w:t>
       </w:r>
     </w:p>
     <w:p>
@@ -15491,7 +19674,7 @@
         <w:pStyle w:val="Heading2"/>
       </w:pPr>
       <w:r>
-        <w:t xml:space="preserve">10.1 Bootstrap the Full Stack</w:t>
+        <w:t xml:space="preserve">11.1 Bootstrap the Full Stack</w:t>
       </w:r>
     </w:p>
     <w:p>
@@ -15737,7 +19920,7 @@
         <w:pStyle w:val="Heading2"/>
       </w:pPr>
       <w:r>
-        <w:t xml:space="preserve">10.2 Useful Make Targets</w:t>
+        <w:t xml:space="preserve">11.2 Useful Make Targets</w:t>
       </w:r>
     </w:p>
     <w:tbl>
@@ -16396,7 +20579,7 @@
         <w:pStyle w:val="Heading2"/>
       </w:pPr>
       <w:r>
-        <w:t xml:space="preserve">10.3 Connect to the Database Directly</w:t>
+        <w:t xml:space="preserve">11.3 Connect to the Database Directly</w:t>
       </w:r>
     </w:p>
     <w:p>
@@ -16729,7 +20912,7 @@
         <w:pStyle w:val="Heading2"/>
       </w:pPr>
       <w:r>
-        <w:t xml:space="preserve">10.4 Development Auth (JWT Skip)</w:t>
+        <w:t xml:space="preserve">11.4 Development Auth (JWT Skip)</w:t>
       </w:r>
     </w:p>
     <w:p>
@@ -17243,7 +21426,7 @@
         <w:pStyle w:val="Heading2"/>
       </w:pPr>
       <w:r>
-        <w:t xml:space="preserve">10.5 Run Regression Tests Locally (Docker Compose)</w:t>
+        <w:t xml:space="preserve">11.5 Run Regression Tests Locally (Docker Compose)</w:t>
       </w:r>
     </w:p>
     <w:p>

</xml_diff>